<commit_message>
Se agrega informe de documentacińo y reflexión grupal
</commit_message>
<xml_diff>
--- a/Fase 2/Evidencias Grupales/2.4_GuiaEstudiante_Fase 2_DesarrolloProyecto APT.docx
+++ b/Fase 2/Evidencias Grupales/2.4_GuiaEstudiante_Fase 2_DesarrolloProyecto APT.docx
@@ -1,11 +1,8 @@
 
 <file path=word/document.xml><?xml version="1.0" encoding="utf-8"?>
-<w:document xmlns:wpc="http://schemas.microsoft.com/office/word/2010/wordprocessingCanvas" xmlns:cx="http://schemas.microsoft.com/office/drawing/2014/chartex" xmlns:mc="http://schemas.openxmlformats.org/markup-compatibility/2006" xmlns:o="urn:schemas-microsoft-com:office:office" xmlns:r="http://schemas.openxmlformats.org/officeDocument/2006/relationships" xmlns:m="http://schemas.openxmlformats.org/officeDocument/2006/math" xmlns:v="urn:schemas-microsoft-com:vml" xmlns:wp14="http://schemas.microsoft.com/office/word/2010/wordprocessingDrawing" xmlns:wp="http://schemas.openxmlformats.org/drawingml/2006/wordprocessingDrawing" xmlns:w10="urn:schemas-microsoft-com:office:word" xmlns:w="http://schemas.openxmlformats.org/wordprocessingml/2006/main" xmlns:w14="http://schemas.microsoft.com/office/word/2010/wordml" xmlns:w15="http://schemas.microsoft.com/office/word/2012/wordml" xmlns:w16se="http://schemas.microsoft.com/office/word/2015/wordml/symex" xmlns:wpg="http://schemas.microsoft.com/office/word/2010/wordprocessingGroup" xmlns:wpi="http://schemas.microsoft.com/office/word/2010/wordprocessingInk" xmlns:wne="http://schemas.microsoft.com/office/word/2006/wordml" xmlns:wps="http://schemas.microsoft.com/office/word/2010/wordprocessingShape" mc:Ignorable="w14 w15 w16se wp14">
+<w:document xmlns:wpc="http://schemas.microsoft.com/office/word/2010/wordprocessingCanvas" xmlns:cx="http://schemas.microsoft.com/office/drawing/2014/chartex" xmlns:cx1="http://schemas.microsoft.com/office/drawing/2015/9/8/chartex" xmlns:cx2="http://schemas.microsoft.com/office/drawing/2015/10/21/chartex" xmlns:cx3="http://schemas.microsoft.com/office/drawing/2016/5/9/chartex" xmlns:cx4="http://schemas.microsoft.com/office/drawing/2016/5/10/chartex" xmlns:cx5="http://schemas.microsoft.com/office/drawing/2016/5/11/chartex" xmlns:cx6="http://schemas.microsoft.com/office/drawing/2016/5/12/chartex" xmlns:cx7="http://schemas.microsoft.com/office/drawing/2016/5/13/chartex" xmlns:cx8="http://schemas.microsoft.com/office/drawing/2016/5/14/chartex" xmlns:mc="http://schemas.openxmlformats.org/markup-compatibility/2006" xmlns:aink="http://schemas.microsoft.com/office/drawing/2016/ink" xmlns:am3d="http://schemas.microsoft.com/office/drawing/2017/model3d" xmlns:o="urn:schemas-microsoft-com:office:office" xmlns:oel="http://schemas.microsoft.com/office/2019/extlst" xmlns:r="http://schemas.openxmlformats.org/officeDocument/2006/relationships" xmlns:m="http://schemas.openxmlformats.org/officeDocument/2006/math" xmlns:v="urn:schemas-microsoft-com:vml" xmlns:wp14="http://schemas.microsoft.com/office/word/2010/wordprocessingDrawing" xmlns:wp="http://schemas.openxmlformats.org/drawingml/2006/wordprocessingDrawing" xmlns:w10="urn:schemas-microsoft-com:office:word" xmlns:w="http://schemas.openxmlformats.org/wordprocessingml/2006/main" xmlns:w14="http://schemas.microsoft.com/office/word/2010/wordml" xmlns:w15="http://schemas.microsoft.com/office/word/2012/wordml" xmlns:w16cex="http://schemas.microsoft.com/office/word/2018/wordml/cex" xmlns:w16cid="http://schemas.microsoft.com/office/word/2016/wordml/cid" xmlns:w16="http://schemas.microsoft.com/office/word/2018/wordml" xmlns:w16du="http://schemas.microsoft.com/office/word/2023/wordml/word16du" xmlns:w16sdtdh="http://schemas.microsoft.com/office/word/2020/wordml/sdtdatahash" xmlns:w16sdtfl="http://schemas.microsoft.com/office/word/2024/wordml/sdtformatlock" xmlns:w16se="http://schemas.microsoft.com/office/word/2015/wordml/symex" xmlns:wpg="http://schemas.microsoft.com/office/word/2010/wordprocessingGroup" xmlns:wpi="http://schemas.microsoft.com/office/word/2010/wordprocessingInk" xmlns:wne="http://schemas.microsoft.com/office/word/2006/wordml" xmlns:wps="http://schemas.microsoft.com/office/word/2010/wordprocessingShape" mc:Ignorable="w14 w15 w16se w16cid w16 w16cex w16sdtdh w16sdtfl w16du wp14">
   <w:body>
-    <w:p>
-      <w:bookmarkStart w:id="0" w:name="_GoBack"/>
-      <w:bookmarkEnd w:id="0"/>
-    </w:p>
+    <w:p/>
     <w:p>
       <w:pPr>
         <w:rPr>
@@ -165,6 +162,7 @@
                                 </w:rPr>
                                 <w:t xml:space="preserve">Asignatura </w:t>
                               </w:r>
+                              <w:proofErr w:type="spellStart"/>
                               <w:r>
                                 <w:rPr>
                                   <w:b/>
@@ -174,6 +172,7 @@
                                 </w:rPr>
                                 <w:t>Capstone</w:t>
                               </w:r>
+                              <w:proofErr w:type="spellEnd"/>
                             </w:p>
                           </w:txbxContent>
                         </wps:txbx>
@@ -238,7 +237,7 @@
           </mc:Choice>
           <mc:Fallback>
             <w:pict>
-              <v:group w14:anchorId="39581AEC" id="Grupo 27" o:spid="_x0000_s1026" style="position:absolute;margin-left:0;margin-top:.75pt;width:491.25pt;height:123pt;z-index:251659264;mso-position-horizontal:center;mso-position-horizontal-relative:margin;mso-width-relative:margin;mso-height-relative:margin" coordsize="59912,15621" o:gfxdata="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">
+              <v:group w14:anchorId="39581AEC" id="Grupo 27" o:spid="_x0000_s1026" style="position:absolute;margin-left:0;margin-top:.75pt;width:491.25pt;height:123pt;z-index:251659264;mso-position-horizontal:center;mso-position-horizontal-relative:margin;mso-width-relative:margin;mso-height-relative:margin" coordsize="59912,15621" o:gfxdata="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">
                 <v:shapetype id="_x0000_t202" coordsize="21600,21600" o:spt="202" path="m,l,21600r21600,l21600,xe">
                   <v:stroke joinstyle="miter"/>
                   <v:path gradientshapeok="t" o:connecttype="rect"/>
@@ -341,6 +340,7 @@
                           </w:rPr>
                           <w:t xml:space="preserve">Asignatura </w:t>
                         </w:r>
+                        <w:proofErr w:type="spellStart"/>
                         <w:r>
                           <w:rPr>
                             <w:b/>
@@ -350,6 +350,7 @@
                           </w:rPr>
                           <w:t>Capstone</w:t>
                         </w:r>
+                        <w:proofErr w:type="spellEnd"/>
                       </w:p>
                     </w:txbxContent>
                   </v:textbox>
@@ -771,17 +772,686 @@
                 <w:lang w:eastAsia="es-CL"/>
               </w:rPr>
             </w:pPr>
-            <w:r>
-              <w:rPr>
-                <w:rFonts w:ascii="Calibri" w:hAnsi="Calibri" w:cs="Arial"/>
-                <w:i/>
-                <w:color w:val="548DD4"/>
-                <w:sz w:val="20"/>
-                <w:szCs w:val="20"/>
-                <w:lang w:eastAsia="es-CL"/>
-              </w:rPr>
-              <w:t>En caso que hayas realizado ajustes a los objetivos o metodología, debes incluir dichos apartados nuevamente en este informe, señalando cuáles son dichos ajustes.</w:t>
-            </w:r>
+            <w:proofErr w:type="gramStart"/>
+            <w:r>
+              <w:rPr>
+                <w:rFonts w:ascii="Calibri" w:hAnsi="Calibri" w:cs="Arial"/>
+                <w:i/>
+                <w:color w:val="548DD4"/>
+                <w:sz w:val="20"/>
+                <w:szCs w:val="20"/>
+                <w:lang w:eastAsia="es-CL"/>
+              </w:rPr>
+              <w:t>En caso que</w:t>
+            </w:r>
+            <w:proofErr w:type="gramEnd"/>
+            <w:r>
+              <w:rPr>
+                <w:rFonts w:ascii="Calibri" w:hAnsi="Calibri" w:cs="Arial"/>
+                <w:i/>
+                <w:color w:val="548DD4"/>
+                <w:sz w:val="20"/>
+                <w:szCs w:val="20"/>
+                <w:lang w:eastAsia="es-CL"/>
+              </w:rPr>
+              <w:t xml:space="preserve"> hayas realizado ajustes a los objetivos o metodología, debes incluir dichos apartados nuevamente en este informe, señalando cuáles son dichos ajustes.</w:t>
+            </w:r>
+          </w:p>
+          <w:p>
+            <w:pPr>
+              <w:jc w:val="both"/>
+              <w:rPr>
+                <w:rFonts w:ascii="Calibri" w:hAnsi="Calibri" w:cs="Arial"/>
+                <w:iCs/>
+                <w:sz w:val="20"/>
+                <w:szCs w:val="20"/>
+                <w:lang w:eastAsia="es-CL"/>
+              </w:rPr>
+            </w:pPr>
+            <w:proofErr w:type="spellStart"/>
+            <w:r>
+              <w:rPr>
+                <w:rFonts w:ascii="Calibri" w:hAnsi="Calibri" w:cs="Arial"/>
+                <w:iCs/>
+                <w:sz w:val="20"/>
+                <w:szCs w:val="20"/>
+                <w:lang w:eastAsia="es-CL"/>
+              </w:rPr>
+              <w:t>NutriLink</w:t>
+            </w:r>
+            <w:proofErr w:type="spellEnd"/>
+            <w:r>
+              <w:rPr>
+                <w:rFonts w:ascii="Calibri" w:hAnsi="Calibri" w:cs="Arial"/>
+                <w:iCs/>
+                <w:sz w:val="20"/>
+                <w:szCs w:val="20"/>
+                <w:lang w:eastAsia="es-CL"/>
+              </w:rPr>
+              <w:t xml:space="preserve"> pasó de tener una base técnica débil a ser una plataforma segura, que cobra, tiene especialidades clínicas, lee exámenes con OCR y ya tiene chat en vivo.</w:t>
+            </w:r>
+          </w:p>
+          <w:p>
+            <w:pPr>
+              <w:jc w:val="both"/>
+              <w:rPr>
+                <w:rFonts w:ascii="Calibri" w:hAnsi="Calibri" w:cs="Arial"/>
+                <w:iCs/>
+                <w:sz w:val="20"/>
+                <w:szCs w:val="20"/>
+                <w:lang w:eastAsia="es-CL"/>
+              </w:rPr>
+            </w:pPr>
+            <w:r>
+              <w:rPr>
+                <w:rFonts w:ascii="Calibri" w:hAnsi="Calibri" w:cs="Arial"/>
+                <w:iCs/>
+                <w:sz w:val="20"/>
+                <w:szCs w:val="20"/>
+                <w:lang w:eastAsia="es-CL"/>
+              </w:rPr>
+              <w:t>Se detalla brevemente lo avanzado en los siguientes puntos:</w:t>
+            </w:r>
+          </w:p>
+          <w:p>
+            <w:pPr>
+              <w:numPr>
+                <w:ilvl w:val="0"/>
+                <w:numId w:val="2"/>
+              </w:numPr>
+              <w:jc w:val="both"/>
+              <w:rPr>
+                <w:rFonts w:ascii="Calibri" w:hAnsi="Calibri" w:cs="Arial"/>
+                <w:iCs/>
+                <w:sz w:val="20"/>
+                <w:szCs w:val="20"/>
+                <w:lang w:eastAsia="es-CL"/>
+              </w:rPr>
+            </w:pPr>
+            <w:r>
+              <w:rPr>
+                <w:rFonts w:ascii="Calibri" w:hAnsi="Calibri" w:cs="Arial"/>
+                <w:iCs/>
+                <w:sz w:val="20"/>
+                <w:szCs w:val="20"/>
+                <w:lang w:eastAsia="es-CL"/>
+              </w:rPr>
+              <w:t xml:space="preserve">Seguridad y base técnica: JWT y </w:t>
+            </w:r>
+            <w:proofErr w:type="spellStart"/>
+            <w:r>
+              <w:rPr>
+                <w:rFonts w:ascii="Calibri" w:hAnsi="Calibri" w:cs="Arial"/>
+                <w:iCs/>
+                <w:sz w:val="20"/>
+                <w:szCs w:val="20"/>
+                <w:lang w:eastAsia="es-CL"/>
+              </w:rPr>
+              <w:t>bcrypt</w:t>
+            </w:r>
+            <w:proofErr w:type="spellEnd"/>
+            <w:r>
+              <w:rPr>
+                <w:rFonts w:ascii="Calibri" w:hAnsi="Calibri" w:cs="Arial"/>
+                <w:iCs/>
+                <w:sz w:val="20"/>
+                <w:szCs w:val="20"/>
+                <w:lang w:eastAsia="es-CL"/>
+              </w:rPr>
+              <w:t xml:space="preserve"> en la web y en la </w:t>
+            </w:r>
+            <w:proofErr w:type="gramStart"/>
+            <w:r>
+              <w:rPr>
+                <w:rFonts w:ascii="Calibri" w:hAnsi="Calibri" w:cs="Arial"/>
+                <w:iCs/>
+                <w:sz w:val="20"/>
+                <w:szCs w:val="20"/>
+                <w:lang w:eastAsia="es-CL"/>
+              </w:rPr>
+              <w:t>app</w:t>
+            </w:r>
+            <w:proofErr w:type="gramEnd"/>
+            <w:r>
+              <w:rPr>
+                <w:rFonts w:ascii="Calibri" w:hAnsi="Calibri" w:cs="Arial"/>
+                <w:iCs/>
+                <w:sz w:val="20"/>
+                <w:szCs w:val="20"/>
+                <w:lang w:eastAsia="es-CL"/>
+              </w:rPr>
+              <w:t xml:space="preserve"> del paciente, </w:t>
+            </w:r>
+            <w:r>
+              <w:rPr>
+                <w:rFonts w:ascii="Calibri" w:hAnsi="Calibri" w:cs="Arial"/>
+                <w:iCs/>
+                <w:sz w:val="20"/>
+                <w:szCs w:val="20"/>
+                <w:lang w:eastAsia="es-CL"/>
+              </w:rPr>
+              <w:t>t</w:t>
+            </w:r>
+            <w:r>
+              <w:rPr>
+                <w:rFonts w:ascii="Calibri" w:hAnsi="Calibri" w:cs="Arial"/>
+                <w:iCs/>
+                <w:sz w:val="20"/>
+                <w:szCs w:val="20"/>
+                <w:lang w:eastAsia="es-CL"/>
+              </w:rPr>
+              <w:t xml:space="preserve">ambién se actualizaron librerías, se refactorizó </w:t>
+            </w:r>
+            <w:proofErr w:type="spellStart"/>
+            <w:r>
+              <w:rPr>
+                <w:rFonts w:ascii="Calibri" w:hAnsi="Calibri" w:cs="Arial"/>
+                <w:iCs/>
+                <w:sz w:val="20"/>
+                <w:szCs w:val="20"/>
+                <w:lang w:eastAsia="es-CL"/>
+              </w:rPr>
+              <w:t>Ionic</w:t>
+            </w:r>
+            <w:proofErr w:type="spellEnd"/>
+            <w:r>
+              <w:rPr>
+                <w:rFonts w:ascii="Calibri" w:hAnsi="Calibri" w:cs="Arial"/>
+                <w:iCs/>
+                <w:sz w:val="20"/>
+                <w:szCs w:val="20"/>
+                <w:lang w:eastAsia="es-CL"/>
+              </w:rPr>
+              <w:t>, se respaldaron funciones de la BD y se reordenó el kit de Postman.</w:t>
+            </w:r>
+          </w:p>
+          <w:p>
+            <w:pPr>
+              <w:numPr>
+                <w:ilvl w:val="0"/>
+                <w:numId w:val="2"/>
+              </w:numPr>
+              <w:jc w:val="both"/>
+              <w:rPr>
+                <w:rFonts w:ascii="Calibri" w:hAnsi="Calibri" w:cs="Arial"/>
+                <w:iCs/>
+                <w:sz w:val="20"/>
+                <w:szCs w:val="20"/>
+                <w:lang w:eastAsia="es-CL"/>
+              </w:rPr>
+            </w:pPr>
+            <w:r>
+              <w:rPr>
+                <w:rFonts w:ascii="Calibri" w:hAnsi="Calibri" w:cs="Arial"/>
+                <w:iCs/>
+                <w:sz w:val="20"/>
+                <w:szCs w:val="20"/>
+                <w:lang w:eastAsia="es-CL"/>
+              </w:rPr>
+              <w:t xml:space="preserve">Monetización: ya funciona todo el flujo de pago con </w:t>
+            </w:r>
+            <w:proofErr w:type="spellStart"/>
+            <w:r>
+              <w:rPr>
+                <w:rFonts w:ascii="Calibri" w:hAnsi="Calibri" w:cs="Arial"/>
+                <w:iCs/>
+                <w:sz w:val="20"/>
+                <w:szCs w:val="20"/>
+                <w:lang w:eastAsia="es-CL"/>
+              </w:rPr>
+              <w:t>ETPay</w:t>
+            </w:r>
+            <w:proofErr w:type="spellEnd"/>
+            <w:r>
+              <w:rPr>
+                <w:rFonts w:ascii="Calibri" w:hAnsi="Calibri" w:cs="Arial"/>
+                <w:iCs/>
+                <w:sz w:val="20"/>
+                <w:szCs w:val="20"/>
+                <w:lang w:eastAsia="es-CL"/>
+              </w:rPr>
+              <w:t xml:space="preserve"> en </w:t>
+            </w:r>
+            <w:proofErr w:type="spellStart"/>
+            <w:r>
+              <w:rPr>
+                <w:rFonts w:ascii="Calibri" w:hAnsi="Calibri" w:cs="Arial"/>
+                <w:iCs/>
+                <w:sz w:val="20"/>
+                <w:szCs w:val="20"/>
+                <w:lang w:eastAsia="es-CL"/>
+              </w:rPr>
+              <w:t>sandbox</w:t>
+            </w:r>
+            <w:proofErr w:type="spellEnd"/>
+            <w:r>
+              <w:rPr>
+                <w:rFonts w:ascii="Calibri" w:hAnsi="Calibri" w:cs="Arial"/>
+                <w:iCs/>
+                <w:sz w:val="20"/>
+                <w:szCs w:val="20"/>
+                <w:lang w:eastAsia="es-CL"/>
+              </w:rPr>
+              <w:t xml:space="preserve">. Eso incluye el diseño en Figma, la pasarela, el </w:t>
+            </w:r>
+            <w:proofErr w:type="spellStart"/>
+            <w:r>
+              <w:rPr>
+                <w:rFonts w:ascii="Calibri" w:hAnsi="Calibri" w:cs="Arial"/>
+                <w:iCs/>
+                <w:sz w:val="20"/>
+                <w:szCs w:val="20"/>
+                <w:lang w:eastAsia="es-CL"/>
+              </w:rPr>
+              <w:t>webhook</w:t>
+            </w:r>
+            <w:proofErr w:type="spellEnd"/>
+            <w:r>
+              <w:rPr>
+                <w:rFonts w:ascii="Calibri" w:hAnsi="Calibri" w:cs="Arial"/>
+                <w:iCs/>
+                <w:sz w:val="20"/>
+                <w:szCs w:val="20"/>
+                <w:lang w:eastAsia="es-CL"/>
+              </w:rPr>
+              <w:t xml:space="preserve"> que activa la suscripción por un mes y el límite de pacientes según plan (</w:t>
+            </w:r>
+            <w:r>
+              <w:rPr>
+                <w:rFonts w:ascii="Calibri" w:hAnsi="Calibri" w:cs="Arial"/>
+                <w:iCs/>
+                <w:sz w:val="20"/>
+                <w:szCs w:val="20"/>
+                <w:lang w:eastAsia="es-CL"/>
+              </w:rPr>
+              <w:t>Gratuito, Starter, Professional y Ultimate</w:t>
+            </w:r>
+            <w:r>
+              <w:rPr>
+                <w:rFonts w:ascii="Calibri" w:hAnsi="Calibri" w:cs="Arial"/>
+                <w:iCs/>
+                <w:sz w:val="20"/>
+                <w:szCs w:val="20"/>
+                <w:lang w:eastAsia="es-CL"/>
+              </w:rPr>
+              <w:t>).</w:t>
+            </w:r>
+          </w:p>
+          <w:p>
+            <w:pPr>
+              <w:numPr>
+                <w:ilvl w:val="0"/>
+                <w:numId w:val="2"/>
+              </w:numPr>
+              <w:jc w:val="both"/>
+              <w:rPr>
+                <w:rFonts w:ascii="Calibri" w:hAnsi="Calibri" w:cs="Arial"/>
+                <w:iCs/>
+                <w:sz w:val="20"/>
+                <w:szCs w:val="20"/>
+                <w:lang w:eastAsia="es-CL"/>
+              </w:rPr>
+            </w:pPr>
+            <w:r>
+              <w:rPr>
+                <w:rFonts w:ascii="Calibri" w:hAnsi="Calibri" w:cs="Arial"/>
+                <w:iCs/>
+                <w:sz w:val="20"/>
+                <w:szCs w:val="20"/>
+                <w:lang w:eastAsia="es-CL"/>
+              </w:rPr>
+              <w:t xml:space="preserve">Especialidades clínicas: </w:t>
+            </w:r>
+            <w:r>
+              <w:rPr>
+                <w:rFonts w:ascii="Calibri" w:hAnsi="Calibri" w:cs="Arial"/>
+                <w:iCs/>
+                <w:sz w:val="20"/>
+                <w:szCs w:val="20"/>
+                <w:lang w:eastAsia="es-CL"/>
+              </w:rPr>
+              <w:t>Se</w:t>
+            </w:r>
+            <w:r>
+              <w:rPr>
+                <w:rFonts w:ascii="Calibri" w:hAnsi="Calibri" w:cs="Arial"/>
+                <w:iCs/>
+                <w:sz w:val="20"/>
+                <w:szCs w:val="20"/>
+                <w:lang w:eastAsia="es-CL"/>
+              </w:rPr>
+              <w:t xml:space="preserve"> investigó e implementó Diabetes (incluye insulinoterapia), Nutrición Deportiva (con prescripción de ejercicio en la minuta), Pediatría y Patología Renal. Todas tienen BD, API y web, y se accede a ellas desde el nuevo botón "Especialidades" de</w:t>
+            </w:r>
+            <w:r>
+              <w:rPr>
+                <w:rFonts w:ascii="Calibri" w:hAnsi="Calibri" w:cs="Arial"/>
+                <w:iCs/>
+                <w:sz w:val="20"/>
+                <w:szCs w:val="20"/>
+                <w:lang w:eastAsia="es-CL"/>
+              </w:rPr>
+              <w:t xml:space="preserve"> la web</w:t>
+            </w:r>
+            <w:r>
+              <w:rPr>
+                <w:rFonts w:ascii="Calibri" w:hAnsi="Calibri" w:cs="Arial"/>
+                <w:iCs/>
+                <w:sz w:val="20"/>
+                <w:szCs w:val="20"/>
+                <w:lang w:eastAsia="es-CL"/>
+              </w:rPr>
+              <w:t xml:space="preserve">. </w:t>
+            </w:r>
+            <w:proofErr w:type="gramStart"/>
+            <w:r>
+              <w:rPr>
+                <w:rFonts w:ascii="Calibri" w:hAnsi="Calibri" w:cs="Arial"/>
+                <w:iCs/>
+                <w:sz w:val="20"/>
+                <w:szCs w:val="20"/>
+                <w:lang w:eastAsia="es-CL"/>
+              </w:rPr>
+              <w:t>Además</w:t>
+            </w:r>
+            <w:proofErr w:type="gramEnd"/>
+            <w:r>
+              <w:rPr>
+                <w:rFonts w:ascii="Calibri" w:hAnsi="Calibri" w:cs="Arial"/>
+                <w:iCs/>
+                <w:sz w:val="20"/>
+                <w:szCs w:val="20"/>
+                <w:lang w:eastAsia="es-CL"/>
+              </w:rPr>
+              <w:t xml:space="preserve"> está lista la Encuesta de Tendencia de Consumo, que calcula el índice de calidad de la dieta (ICA).</w:t>
+            </w:r>
+          </w:p>
+          <w:p>
+            <w:pPr>
+              <w:numPr>
+                <w:ilvl w:val="0"/>
+                <w:numId w:val="2"/>
+              </w:numPr>
+              <w:jc w:val="both"/>
+              <w:rPr>
+                <w:rFonts w:ascii="Calibri" w:hAnsi="Calibri" w:cs="Arial"/>
+                <w:iCs/>
+                <w:sz w:val="20"/>
+                <w:szCs w:val="20"/>
+                <w:lang w:eastAsia="es-CL"/>
+              </w:rPr>
+            </w:pPr>
+            <w:r>
+              <w:rPr>
+                <w:rFonts w:ascii="Calibri" w:hAnsi="Calibri" w:cs="Arial"/>
+                <w:iCs/>
+                <w:sz w:val="20"/>
+                <w:szCs w:val="20"/>
+                <w:lang w:eastAsia="es-CL"/>
+              </w:rPr>
+              <w:t xml:space="preserve">Exámenes y OCR: </w:t>
+            </w:r>
+            <w:r>
+              <w:rPr>
+                <w:rFonts w:ascii="Calibri" w:hAnsi="Calibri" w:cs="Arial"/>
+                <w:iCs/>
+                <w:sz w:val="20"/>
+                <w:szCs w:val="20"/>
+                <w:lang w:eastAsia="es-CL"/>
+              </w:rPr>
+              <w:t>Se</w:t>
+            </w:r>
+            <w:r>
+              <w:rPr>
+                <w:rFonts w:ascii="Calibri" w:hAnsi="Calibri" w:cs="Arial"/>
+                <w:iCs/>
+                <w:sz w:val="20"/>
+                <w:szCs w:val="20"/>
+                <w:lang w:eastAsia="es-CL"/>
+              </w:rPr>
+              <w:t xml:space="preserve"> armó el almacenamiento en </w:t>
+            </w:r>
+            <w:proofErr w:type="spellStart"/>
+            <w:r>
+              <w:rPr>
+                <w:rFonts w:ascii="Calibri" w:hAnsi="Calibri" w:cs="Arial"/>
+                <w:iCs/>
+                <w:sz w:val="20"/>
+                <w:szCs w:val="20"/>
+                <w:lang w:eastAsia="es-CL"/>
+              </w:rPr>
+              <w:t>Cloudflare</w:t>
+            </w:r>
+            <w:proofErr w:type="spellEnd"/>
+            <w:r>
+              <w:rPr>
+                <w:rFonts w:ascii="Calibri" w:hAnsi="Calibri" w:cs="Arial"/>
+                <w:iCs/>
+                <w:sz w:val="20"/>
+                <w:szCs w:val="20"/>
+                <w:lang w:eastAsia="es-CL"/>
+              </w:rPr>
+              <w:t xml:space="preserve"> R2, los </w:t>
+            </w:r>
+            <w:proofErr w:type="spellStart"/>
+            <w:r>
+              <w:rPr>
+                <w:rFonts w:ascii="Calibri" w:hAnsi="Calibri" w:cs="Arial"/>
+                <w:iCs/>
+                <w:sz w:val="20"/>
+                <w:szCs w:val="20"/>
+                <w:lang w:eastAsia="es-CL"/>
+              </w:rPr>
+              <w:t>endpoints</w:t>
+            </w:r>
+            <w:proofErr w:type="spellEnd"/>
+            <w:r>
+              <w:rPr>
+                <w:rFonts w:ascii="Calibri" w:hAnsi="Calibri" w:cs="Arial"/>
+                <w:iCs/>
+                <w:sz w:val="20"/>
+                <w:szCs w:val="20"/>
+                <w:lang w:eastAsia="es-CL"/>
+              </w:rPr>
+              <w:t xml:space="preserve"> y la subida de exámenes desde la web con sus validaciones. También </w:t>
+            </w:r>
+            <w:r>
+              <w:rPr>
+                <w:rFonts w:ascii="Calibri" w:hAnsi="Calibri" w:cs="Arial"/>
+                <w:iCs/>
+                <w:sz w:val="20"/>
+                <w:szCs w:val="20"/>
+                <w:lang w:eastAsia="es-CL"/>
+              </w:rPr>
+              <w:t xml:space="preserve">se </w:t>
+            </w:r>
+            <w:r>
+              <w:rPr>
+                <w:rFonts w:ascii="Calibri" w:hAnsi="Calibri" w:cs="Arial"/>
+                <w:iCs/>
+                <w:sz w:val="20"/>
+                <w:szCs w:val="20"/>
+                <w:lang w:eastAsia="es-CL"/>
+              </w:rPr>
+              <w:lastRenderedPageBreak/>
+              <w:t xml:space="preserve">investigó cómo pasar los exámenes a </w:t>
+            </w:r>
+            <w:proofErr w:type="spellStart"/>
+            <w:r>
+              <w:rPr>
+                <w:rFonts w:ascii="Calibri" w:hAnsi="Calibri" w:cs="Arial"/>
+                <w:iCs/>
+                <w:sz w:val="20"/>
+                <w:szCs w:val="20"/>
+                <w:lang w:eastAsia="es-CL"/>
+              </w:rPr>
+              <w:t>Markdown</w:t>
+            </w:r>
+            <w:proofErr w:type="spellEnd"/>
+            <w:r>
+              <w:rPr>
+                <w:rFonts w:ascii="Calibri" w:hAnsi="Calibri" w:cs="Arial"/>
+                <w:iCs/>
+                <w:sz w:val="20"/>
+                <w:szCs w:val="20"/>
+                <w:lang w:eastAsia="es-CL"/>
+              </w:rPr>
+              <w:t xml:space="preserve"> y ya está desplegado el OCR en la </w:t>
+            </w:r>
+            <w:proofErr w:type="gramStart"/>
+            <w:r>
+              <w:rPr>
+                <w:rFonts w:ascii="Calibri" w:hAnsi="Calibri" w:cs="Arial"/>
+                <w:iCs/>
+                <w:sz w:val="20"/>
+                <w:szCs w:val="20"/>
+                <w:lang w:eastAsia="es-CL"/>
+              </w:rPr>
+              <w:t>app</w:t>
+            </w:r>
+            <w:proofErr w:type="gramEnd"/>
+            <w:r>
+              <w:rPr>
+                <w:rFonts w:ascii="Calibri" w:hAnsi="Calibri" w:cs="Arial"/>
+                <w:iCs/>
+                <w:sz w:val="20"/>
+                <w:szCs w:val="20"/>
+                <w:lang w:eastAsia="es-CL"/>
+              </w:rPr>
+              <w:t xml:space="preserve"> del paciente, más el Diagrama de Arquitectura.</w:t>
+            </w:r>
+          </w:p>
+          <w:p>
+            <w:pPr>
+              <w:numPr>
+                <w:ilvl w:val="0"/>
+                <w:numId w:val="2"/>
+              </w:numPr>
+              <w:jc w:val="both"/>
+              <w:rPr>
+                <w:rFonts w:ascii="Calibri" w:hAnsi="Calibri" w:cs="Arial"/>
+                <w:iCs/>
+                <w:sz w:val="20"/>
+                <w:szCs w:val="20"/>
+                <w:lang w:eastAsia="es-CL"/>
+              </w:rPr>
+            </w:pPr>
+            <w:r>
+              <w:rPr>
+                <w:rFonts w:ascii="Calibri" w:hAnsi="Calibri" w:cs="Arial"/>
+                <w:iCs/>
+                <w:sz w:val="20"/>
+                <w:szCs w:val="20"/>
+                <w:lang w:eastAsia="es-CL"/>
+              </w:rPr>
+              <w:t xml:space="preserve">Telemedicina: el chat en tiempo real entre nutricionista y paciente está listo de punta a punta: la API con </w:t>
+            </w:r>
+            <w:hyperlink r:id="rId10" w:tgtFrame="_blank" w:history="1">
+              <w:r>
+                <w:rPr>
+                  <w:rStyle w:val="Hipervnculo"/>
+                  <w:rFonts w:ascii="Calibri" w:hAnsi="Calibri" w:cs="Arial"/>
+                  <w:iCs/>
+                  <w:color w:val="auto"/>
+                  <w:sz w:val="20"/>
+                  <w:szCs w:val="20"/>
+                  <w:lang w:eastAsia="es-CL"/>
+                </w:rPr>
+                <w:t>Socket.io</w:t>
+              </w:r>
+            </w:hyperlink>
+            <w:r>
+              <w:rPr>
+                <w:rFonts w:ascii="Calibri" w:hAnsi="Calibri" w:cs="Arial"/>
+                <w:iCs/>
+                <w:sz w:val="20"/>
+                <w:szCs w:val="20"/>
+                <w:lang w:eastAsia="es-CL"/>
+              </w:rPr>
+              <w:t xml:space="preserve">, la web en Django y la </w:t>
+            </w:r>
+            <w:proofErr w:type="gramStart"/>
+            <w:r>
+              <w:rPr>
+                <w:rFonts w:ascii="Calibri" w:hAnsi="Calibri" w:cs="Arial"/>
+                <w:iCs/>
+                <w:sz w:val="20"/>
+                <w:szCs w:val="20"/>
+                <w:lang w:eastAsia="es-CL"/>
+              </w:rPr>
+              <w:t>app</w:t>
+            </w:r>
+            <w:proofErr w:type="gramEnd"/>
+            <w:r>
+              <w:rPr>
+                <w:rFonts w:ascii="Calibri" w:hAnsi="Calibri" w:cs="Arial"/>
+                <w:iCs/>
+                <w:sz w:val="20"/>
+                <w:szCs w:val="20"/>
+                <w:lang w:eastAsia="es-CL"/>
+              </w:rPr>
+              <w:t xml:space="preserve"> en </w:t>
+            </w:r>
+            <w:proofErr w:type="spellStart"/>
+            <w:r>
+              <w:rPr>
+                <w:rFonts w:ascii="Calibri" w:hAnsi="Calibri" w:cs="Arial"/>
+                <w:iCs/>
+                <w:sz w:val="20"/>
+                <w:szCs w:val="20"/>
+                <w:lang w:eastAsia="es-CL"/>
+              </w:rPr>
+              <w:t>Ionic</w:t>
+            </w:r>
+            <w:proofErr w:type="spellEnd"/>
+            <w:r>
+              <w:rPr>
+                <w:rFonts w:ascii="Calibri" w:hAnsi="Calibri" w:cs="Arial"/>
+                <w:iCs/>
+                <w:sz w:val="20"/>
+                <w:szCs w:val="20"/>
+                <w:lang w:eastAsia="es-CL"/>
+              </w:rPr>
+              <w:t>.</w:t>
+            </w:r>
+          </w:p>
+          <w:p>
+            <w:pPr>
+              <w:numPr>
+                <w:ilvl w:val="0"/>
+                <w:numId w:val="2"/>
+              </w:numPr>
+              <w:jc w:val="both"/>
+              <w:rPr>
+                <w:rFonts w:ascii="Calibri" w:hAnsi="Calibri" w:cs="Arial"/>
+                <w:iCs/>
+                <w:sz w:val="20"/>
+                <w:szCs w:val="20"/>
+                <w:lang w:eastAsia="es-CL"/>
+              </w:rPr>
+            </w:pPr>
+            <w:r>
+              <w:rPr>
+                <w:rFonts w:ascii="Calibri" w:hAnsi="Calibri" w:cs="Arial"/>
+                <w:iCs/>
+                <w:sz w:val="20"/>
+                <w:szCs w:val="20"/>
+                <w:lang w:eastAsia="es-CL"/>
+              </w:rPr>
+              <w:t>Otros: se rediseñaron las pantallas de login y registro, se separaron los archivos estáticos, se arregló el envío de correos y se actualizó el Modelo de Datos de la Fase 2.</w:t>
+            </w:r>
+          </w:p>
+          <w:p>
+            <w:pPr>
+              <w:jc w:val="both"/>
+              <w:rPr>
+                <w:rFonts w:ascii="Calibri" w:hAnsi="Calibri" w:cs="Arial"/>
+                <w:iCs/>
+                <w:color w:val="548DD4"/>
+                <w:sz w:val="20"/>
+                <w:szCs w:val="20"/>
+                <w:lang w:eastAsia="es-CL"/>
+              </w:rPr>
+            </w:pPr>
           </w:p>
         </w:tc>
       </w:tr>
@@ -806,6 +1476,7 @@
                 <w:rFonts w:ascii="Calibri" w:hAnsi="Calibri"/>
                 <w:color w:val="1F3864" w:themeColor="accent1" w:themeShade="80"/>
               </w:rPr>
+              <w:lastRenderedPageBreak/>
               <w:t>Objetivos</w:t>
             </w:r>
           </w:p>
@@ -820,24 +1491,22 @@
               <w:jc w:val="both"/>
               <w:rPr>
                 <w:rFonts w:ascii="Calibri" w:hAnsi="Calibri" w:cs="Arial"/>
-                <w:b/>
-                <w:i/>
-                <w:color w:val="548DD4"/>
-                <w:sz w:val="20"/>
-                <w:szCs w:val="20"/>
-                <w:lang w:eastAsia="es-CL"/>
-              </w:rPr>
-            </w:pPr>
-            <w:r>
-              <w:rPr>
-                <w:rFonts w:ascii="Calibri" w:hAnsi="Calibri" w:cs="Arial"/>
-                <w:i/>
-                <w:color w:val="548DD4"/>
-                <w:sz w:val="20"/>
-                <w:szCs w:val="20"/>
-                <w:lang w:eastAsia="es-CL"/>
-              </w:rPr>
-              <w:t>Opcional en caso de ajuste</w:t>
+                <w:i/>
+                <w:color w:val="548DD4"/>
+                <w:sz w:val="20"/>
+                <w:szCs w:val="20"/>
+                <w:lang w:eastAsia="es-CL"/>
+              </w:rPr>
+            </w:pPr>
+            <w:r>
+              <w:rPr>
+                <w:rFonts w:ascii="Calibri" w:hAnsi="Calibri" w:cs="Arial"/>
+                <w:i/>
+                <w:sz w:val="20"/>
+                <w:szCs w:val="20"/>
+                <w:lang w:eastAsia="es-CL"/>
+              </w:rPr>
+              <w:t>Sin ajustes</w:t>
             </w:r>
           </w:p>
         </w:tc>
@@ -888,12 +1557,11 @@
               <w:rPr>
                 <w:rFonts w:ascii="Calibri" w:hAnsi="Calibri" w:cs="Arial"/>
                 <w:i/>
-                <w:color w:val="548DD4"/>
-                <w:sz w:val="20"/>
-                <w:szCs w:val="20"/>
-                <w:lang w:eastAsia="es-CL"/>
-              </w:rPr>
-              <w:t>Opcional en caso de ajuste</w:t>
+                <w:sz w:val="20"/>
+                <w:szCs w:val="20"/>
+                <w:lang w:eastAsia="es-CL"/>
+              </w:rPr>
+              <w:t>Sin ajustes</w:t>
             </w:r>
           </w:p>
         </w:tc>
@@ -1278,7 +1946,6 @@
               <w:jc w:val="both"/>
               <w:rPr>
                 <w:rFonts w:ascii="Calibri" w:hAnsi="Calibri" w:cs="Arial"/>
-                <w:b/>
                 <w:i/>
                 <w:color w:val="548DD4"/>
                 <w:sz w:val="20"/>
@@ -1297,6 +1964,400 @@
               </w:rPr>
               <w:t>En este apartado adjuntar la(s) evidencia(s) seleccionada(s) para ser evaluada por el docente.</w:t>
             </w:r>
+          </w:p>
+          <w:p>
+            <w:pPr>
+              <w:jc w:val="both"/>
+              <w:rPr>
+                <w:rFonts w:ascii="Calibri" w:hAnsi="Calibri" w:cs="Arial"/>
+                <w:bCs/>
+                <w:iCs/>
+                <w:sz w:val="20"/>
+                <w:szCs w:val="20"/>
+                <w:lang w:eastAsia="es-CL"/>
+              </w:rPr>
+            </w:pPr>
+            <w:r>
+              <w:rPr>
+                <w:rFonts w:ascii="Calibri" w:hAnsi="Calibri" w:cs="Arial"/>
+                <w:bCs/>
+                <w:iCs/>
+                <w:sz w:val="20"/>
+                <w:szCs w:val="20"/>
+                <w:lang w:eastAsia="es-CL"/>
+              </w:rPr>
+              <w:t>Para respaldar el estado actual del desarrollo del Proyecto APT, se presentan las siguientes evidencias que permiten verificar de manera tangible el progreso técnico y de gestión</w:t>
+            </w:r>
+            <w:r>
+              <w:rPr>
+                <w:rFonts w:ascii="Calibri" w:hAnsi="Calibri" w:cs="Arial"/>
+                <w:bCs/>
+                <w:iCs/>
+                <w:sz w:val="20"/>
+                <w:szCs w:val="20"/>
+                <w:lang w:eastAsia="es-CL"/>
+              </w:rPr>
+              <w:t xml:space="preserve"> en el Informe de Sistema de Aplicación</w:t>
+            </w:r>
+            <w:r>
+              <w:rPr>
+                <w:rFonts w:ascii="Calibri" w:hAnsi="Calibri" w:cs="Arial"/>
+                <w:bCs/>
+                <w:iCs/>
+                <w:sz w:val="20"/>
+                <w:szCs w:val="20"/>
+                <w:lang w:eastAsia="es-CL"/>
+              </w:rPr>
+              <w:t>:</w:t>
+            </w:r>
+          </w:p>
+          <w:p>
+            <w:pPr>
+              <w:numPr>
+                <w:ilvl w:val="0"/>
+                <w:numId w:val="4"/>
+              </w:numPr>
+              <w:jc w:val="both"/>
+              <w:rPr>
+                <w:rFonts w:ascii="Calibri" w:hAnsi="Calibri" w:cs="Arial"/>
+                <w:bCs/>
+                <w:iCs/>
+                <w:sz w:val="20"/>
+                <w:szCs w:val="20"/>
+                <w:lang w:eastAsia="es-CL"/>
+              </w:rPr>
+            </w:pPr>
+            <w:r>
+              <w:rPr>
+                <w:rFonts w:ascii="Calibri" w:hAnsi="Calibri" w:cs="Arial"/>
+                <w:bCs/>
+                <w:iCs/>
+                <w:sz w:val="20"/>
+                <w:szCs w:val="20"/>
+                <w:lang w:eastAsia="es-CL"/>
+              </w:rPr>
+              <w:t xml:space="preserve">Capturas </w:t>
+            </w:r>
+            <w:r>
+              <w:rPr>
+                <w:rFonts w:ascii="Calibri" w:hAnsi="Calibri" w:cs="Arial"/>
+                <w:bCs/>
+                <w:iCs/>
+                <w:sz w:val="20"/>
+                <w:szCs w:val="20"/>
+                <w:lang w:eastAsia="es-CL"/>
+              </w:rPr>
+              <w:t>del entorno de alojamiento que demuestran la operatividad y disponibilidad real del sistema en un ambiente de producción/pruebas</w:t>
+            </w:r>
+            <w:r>
+              <w:rPr>
+                <w:rFonts w:ascii="Calibri" w:hAnsi="Calibri" w:cs="Arial"/>
+                <w:bCs/>
+                <w:iCs/>
+                <w:sz w:val="20"/>
+                <w:szCs w:val="20"/>
+                <w:lang w:eastAsia="es-CL"/>
+              </w:rPr>
+              <w:t xml:space="preserve"> mediante </w:t>
+            </w:r>
+            <w:proofErr w:type="spellStart"/>
+            <w:r>
+              <w:rPr>
+                <w:rFonts w:ascii="Calibri" w:hAnsi="Calibri" w:cs="Arial"/>
+                <w:bCs/>
+                <w:iCs/>
+                <w:sz w:val="20"/>
+                <w:szCs w:val="20"/>
+                <w:lang w:eastAsia="es-CL"/>
+              </w:rPr>
+              <w:t>Railway</w:t>
+            </w:r>
+            <w:proofErr w:type="spellEnd"/>
+            <w:r>
+              <w:rPr>
+                <w:rFonts w:ascii="Calibri" w:hAnsi="Calibri" w:cs="Arial"/>
+                <w:bCs/>
+                <w:iCs/>
+                <w:sz w:val="20"/>
+                <w:szCs w:val="20"/>
+                <w:lang w:eastAsia="es-CL"/>
+              </w:rPr>
+              <w:t>.</w:t>
+            </w:r>
+          </w:p>
+          <w:p>
+            <w:pPr>
+              <w:numPr>
+                <w:ilvl w:val="0"/>
+                <w:numId w:val="4"/>
+              </w:numPr>
+              <w:jc w:val="both"/>
+              <w:rPr>
+                <w:rFonts w:ascii="Calibri" w:hAnsi="Calibri" w:cs="Arial"/>
+                <w:bCs/>
+                <w:iCs/>
+                <w:sz w:val="20"/>
+                <w:szCs w:val="20"/>
+                <w:lang w:eastAsia="es-CL"/>
+              </w:rPr>
+            </w:pPr>
+            <w:r>
+              <w:rPr>
+                <w:rFonts w:ascii="Calibri" w:hAnsi="Calibri" w:cs="Arial"/>
+                <w:bCs/>
+                <w:iCs/>
+                <w:sz w:val="20"/>
+                <w:szCs w:val="20"/>
+                <w:lang w:eastAsia="es-CL"/>
+              </w:rPr>
+              <w:t xml:space="preserve">Evidencia del backlog y la estructuración por </w:t>
+            </w:r>
+            <w:proofErr w:type="spellStart"/>
+            <w:r>
+              <w:rPr>
+                <w:rFonts w:ascii="Calibri" w:hAnsi="Calibri" w:cs="Arial"/>
+                <w:bCs/>
+                <w:iCs/>
+                <w:sz w:val="20"/>
+                <w:szCs w:val="20"/>
+                <w:lang w:eastAsia="es-CL"/>
+              </w:rPr>
+              <w:t>sprints</w:t>
+            </w:r>
+            <w:proofErr w:type="spellEnd"/>
+            <w:r>
+              <w:rPr>
+                <w:rFonts w:ascii="Calibri" w:hAnsi="Calibri" w:cs="Arial"/>
+                <w:bCs/>
+                <w:iCs/>
+                <w:sz w:val="20"/>
+                <w:szCs w:val="20"/>
+                <w:lang w:eastAsia="es-CL"/>
+              </w:rPr>
+              <w:t xml:space="preserve"> en </w:t>
+            </w:r>
+            <w:proofErr w:type="spellStart"/>
+            <w:r>
+              <w:rPr>
+                <w:rFonts w:ascii="Calibri" w:hAnsi="Calibri" w:cs="Arial"/>
+                <w:bCs/>
+                <w:iCs/>
+                <w:sz w:val="20"/>
+                <w:szCs w:val="20"/>
+                <w:lang w:eastAsia="es-CL"/>
+              </w:rPr>
+              <w:t>ClickUp</w:t>
+            </w:r>
+            <w:proofErr w:type="spellEnd"/>
+            <w:r>
+              <w:rPr>
+                <w:rFonts w:ascii="Calibri" w:hAnsi="Calibri" w:cs="Arial"/>
+                <w:bCs/>
+                <w:iCs/>
+                <w:sz w:val="20"/>
+                <w:szCs w:val="20"/>
+                <w:lang w:eastAsia="es-CL"/>
+              </w:rPr>
+              <w:t>, lo que acredita el seguimiento metódico de las tareas, la asignación de responsabilidades y el cumplimiento del cronograma.</w:t>
+            </w:r>
+          </w:p>
+          <w:p>
+            <w:pPr>
+              <w:numPr>
+                <w:ilvl w:val="0"/>
+                <w:numId w:val="4"/>
+              </w:numPr>
+              <w:jc w:val="both"/>
+              <w:rPr>
+                <w:rFonts w:ascii="Calibri" w:hAnsi="Calibri" w:cs="Arial"/>
+                <w:bCs/>
+                <w:iCs/>
+                <w:sz w:val="20"/>
+                <w:szCs w:val="20"/>
+                <w:lang w:eastAsia="es-CL"/>
+              </w:rPr>
+            </w:pPr>
+            <w:r>
+              <w:rPr>
+                <w:rFonts w:ascii="Calibri" w:hAnsi="Calibri" w:cs="Arial"/>
+                <w:bCs/>
+                <w:iCs/>
+                <w:sz w:val="20"/>
+                <w:szCs w:val="20"/>
+                <w:lang w:eastAsia="es-CL"/>
+              </w:rPr>
+              <w:t xml:space="preserve">Registro de la ejecución de pruebas </w:t>
+            </w:r>
+            <w:r>
+              <w:rPr>
+                <w:rFonts w:ascii="Calibri" w:hAnsi="Calibri" w:cs="Arial"/>
+                <w:bCs/>
+                <w:iCs/>
+                <w:sz w:val="20"/>
+                <w:szCs w:val="20"/>
+                <w:lang w:eastAsia="es-CL"/>
+              </w:rPr>
+              <w:t xml:space="preserve">de integración </w:t>
+            </w:r>
+            <w:r>
+              <w:rPr>
+                <w:rFonts w:ascii="Calibri" w:hAnsi="Calibri" w:cs="Arial"/>
+                <w:bCs/>
+                <w:iCs/>
+                <w:sz w:val="20"/>
+                <w:szCs w:val="20"/>
+                <w:lang w:eastAsia="es-CL"/>
+              </w:rPr>
+              <w:t xml:space="preserve">sobre las APIs, validando el correcto funcionamiento de los </w:t>
+            </w:r>
+            <w:proofErr w:type="spellStart"/>
+            <w:r>
+              <w:rPr>
+                <w:rFonts w:ascii="Calibri" w:hAnsi="Calibri" w:cs="Arial"/>
+                <w:bCs/>
+                <w:iCs/>
+                <w:sz w:val="20"/>
+                <w:szCs w:val="20"/>
+                <w:lang w:eastAsia="es-CL"/>
+              </w:rPr>
+              <w:t>endpoints</w:t>
+            </w:r>
+            <w:proofErr w:type="spellEnd"/>
+            <w:r>
+              <w:rPr>
+                <w:rFonts w:ascii="Calibri" w:hAnsi="Calibri" w:cs="Arial"/>
+                <w:bCs/>
+                <w:iCs/>
+                <w:sz w:val="20"/>
+                <w:szCs w:val="20"/>
+                <w:lang w:eastAsia="es-CL"/>
+              </w:rPr>
+              <w:t>, la integración entre servicios y la seguridad (tokens)</w:t>
+            </w:r>
+            <w:r>
+              <w:rPr>
+                <w:rFonts w:ascii="Calibri" w:hAnsi="Calibri" w:cs="Arial"/>
+                <w:bCs/>
+                <w:iCs/>
+                <w:sz w:val="20"/>
+                <w:szCs w:val="20"/>
+                <w:lang w:eastAsia="es-CL"/>
+              </w:rPr>
+              <w:t xml:space="preserve"> a través de Postman.</w:t>
+            </w:r>
+          </w:p>
+          <w:p>
+            <w:pPr>
+              <w:numPr>
+                <w:ilvl w:val="0"/>
+                <w:numId w:val="4"/>
+              </w:numPr>
+              <w:jc w:val="both"/>
+              <w:rPr>
+                <w:rFonts w:ascii="Calibri" w:hAnsi="Calibri" w:cs="Arial"/>
+                <w:bCs/>
+                <w:iCs/>
+                <w:sz w:val="20"/>
+                <w:szCs w:val="20"/>
+                <w:lang w:eastAsia="es-CL"/>
+              </w:rPr>
+            </w:pPr>
+            <w:r>
+              <w:rPr>
+                <w:rFonts w:ascii="Calibri" w:hAnsi="Calibri" w:cs="Arial"/>
+                <w:bCs/>
+                <w:iCs/>
+                <w:sz w:val="20"/>
+                <w:szCs w:val="20"/>
+                <w:lang w:eastAsia="es-CL"/>
+              </w:rPr>
+              <w:t xml:space="preserve">Capturas </w:t>
+            </w:r>
+            <w:r>
+              <w:rPr>
+                <w:rFonts w:ascii="Calibri" w:hAnsi="Calibri" w:cs="Arial"/>
+                <w:bCs/>
+                <w:iCs/>
+                <w:sz w:val="20"/>
+                <w:szCs w:val="20"/>
+                <w:lang w:eastAsia="es-CL"/>
+              </w:rPr>
+              <w:t xml:space="preserve">de UI </w:t>
+            </w:r>
+            <w:r>
+              <w:rPr>
+                <w:rFonts w:ascii="Calibri" w:hAnsi="Calibri" w:cs="Arial"/>
+                <w:bCs/>
+                <w:iCs/>
+                <w:sz w:val="20"/>
+                <w:szCs w:val="20"/>
+                <w:lang w:eastAsia="es-CL"/>
+              </w:rPr>
+              <w:t>acompañadas de una breve descripción que explican el propósito funcional de las pantallas desarrolladas hasta la fecha.</w:t>
+            </w:r>
+          </w:p>
+          <w:p>
+            <w:pPr>
+              <w:numPr>
+                <w:ilvl w:val="0"/>
+                <w:numId w:val="4"/>
+              </w:numPr>
+              <w:jc w:val="both"/>
+              <w:rPr>
+                <w:rFonts w:ascii="Calibri" w:hAnsi="Calibri" w:cs="Arial"/>
+                <w:bCs/>
+                <w:iCs/>
+                <w:sz w:val="20"/>
+                <w:szCs w:val="20"/>
+                <w:lang w:eastAsia="es-CL"/>
+              </w:rPr>
+            </w:pPr>
+            <w:r>
+              <w:rPr>
+                <w:rFonts w:ascii="Calibri" w:hAnsi="Calibri" w:cs="Arial"/>
+                <w:bCs/>
+                <w:iCs/>
+                <w:sz w:val="20"/>
+                <w:szCs w:val="20"/>
+                <w:lang w:eastAsia="es-CL"/>
+              </w:rPr>
+              <w:t xml:space="preserve">Enlaces a los repositorios </w:t>
+            </w:r>
+            <w:r>
+              <w:rPr>
+                <w:rFonts w:ascii="Calibri" w:hAnsi="Calibri" w:cs="Arial"/>
+                <w:bCs/>
+                <w:iCs/>
+                <w:sz w:val="20"/>
+                <w:szCs w:val="20"/>
+                <w:lang w:eastAsia="es-CL"/>
+              </w:rPr>
+              <w:t xml:space="preserve">de código fuente y documentación de la base de datos </w:t>
+            </w:r>
+            <w:r>
+              <w:rPr>
+                <w:rFonts w:ascii="Calibri" w:hAnsi="Calibri" w:cs="Arial"/>
+                <w:bCs/>
+                <w:iCs/>
+                <w:sz w:val="20"/>
+                <w:szCs w:val="20"/>
+                <w:lang w:eastAsia="es-CL"/>
+              </w:rPr>
+              <w:t>que evidencian la modularidad, estructuración y control de versiones de cada componente del sistema.</w:t>
+            </w:r>
+          </w:p>
+          <w:p>
+            <w:pPr>
+              <w:jc w:val="both"/>
+              <w:rPr>
+                <w:rFonts w:ascii="Calibri" w:hAnsi="Calibri" w:cs="Arial"/>
+                <w:bCs/>
+                <w:iCs/>
+                <w:sz w:val="20"/>
+                <w:szCs w:val="20"/>
+                <w:lang w:eastAsia="es-CL"/>
+              </w:rPr>
+            </w:pPr>
           </w:p>
         </w:tc>
       </w:tr>
@@ -2631,69 +3692,89 @@
               </w:rPr>
               <w:t xml:space="preserve">solucionarlas. </w:t>
             </w:r>
-            <w:r>
+          </w:p>
+          <w:p>
+            <w:pPr>
               <w:rPr>
                 <w:rFonts w:ascii="Calibri" w:hAnsi="Calibri"/>
-                <w:b/>
-                <w:color w:val="1F3864" w:themeColor="accent1" w:themeShade="80"/>
-              </w:rPr>
-              <w:t xml:space="preserve"> </w:t>
-            </w:r>
-          </w:p>
-          <w:p>
-            <w:pPr>
+              </w:rPr>
+            </w:pPr>
+            <w:r>
               <w:rPr>
                 <w:rFonts w:ascii="Calibri" w:hAnsi="Calibri"/>
-                <w:color w:val="1F3864" w:themeColor="accent1" w:themeShade="80"/>
-              </w:rPr>
-            </w:pPr>
-          </w:p>
-          <w:p>
-            <w:pPr>
+              </w:rPr>
+              <w:t xml:space="preserve">La gestión del trabajo mediante un tablero en la herramienta </w:t>
+            </w:r>
+            <w:proofErr w:type="spellStart"/>
+            <w:r>
               <w:rPr>
                 <w:rFonts w:ascii="Calibri" w:hAnsi="Calibri"/>
-                <w:color w:val="1F3864" w:themeColor="accent1" w:themeShade="80"/>
-              </w:rPr>
-            </w:pPr>
-          </w:p>
-          <w:p>
-            <w:pPr>
-              <w:jc w:val="both"/>
-              <w:rPr>
-                <w:rFonts w:ascii="Calibri" w:hAnsi="Calibri" w:cs="Arial"/>
-                <w:i/>
-                <w:color w:val="548DD4"/>
-                <w:sz w:val="20"/>
-                <w:szCs w:val="20"/>
-                <w:lang w:eastAsia="es-CL"/>
-              </w:rPr>
-            </w:pPr>
-          </w:p>
-          <w:p>
-            <w:pPr>
-              <w:jc w:val="both"/>
-              <w:rPr>
-                <w:rFonts w:ascii="Calibri" w:hAnsi="Calibri" w:cs="Arial"/>
-                <w:i/>
-                <w:color w:val="548DD4"/>
-                <w:sz w:val="20"/>
-                <w:szCs w:val="20"/>
-                <w:lang w:eastAsia="es-CL"/>
-              </w:rPr>
-            </w:pPr>
-          </w:p>
-          <w:p>
-            <w:pPr>
-              <w:jc w:val="both"/>
-              <w:rPr>
-                <w:rFonts w:ascii="Calibri" w:hAnsi="Calibri" w:cs="Arial"/>
-                <w:i/>
-                <w:color w:val="548DD4"/>
-                <w:sz w:val="20"/>
-                <w:szCs w:val="20"/>
-                <w:lang w:eastAsia="es-CL"/>
-              </w:rPr>
-            </w:pPr>
+              </w:rPr>
+              <w:t>ClickUp</w:t>
+            </w:r>
+            <w:proofErr w:type="spellEnd"/>
+            <w:r>
+              <w:rPr>
+                <w:rFonts w:ascii="Calibri" w:hAnsi="Calibri"/>
+              </w:rPr>
+              <w:t xml:space="preserve"> ha sido un factor determinante para el desarrollo del proyecto. Su uso ha facilitado el seguimiento de objetivos, la asignación de tareas, el control de responsabilidades y la adopción de una disciplina constante en la documentación del trabajo realizado.</w:t>
+            </w:r>
+          </w:p>
+          <w:p>
+            <w:pPr>
+              <w:rPr>
+                <w:rFonts w:ascii="Calibri" w:hAnsi="Calibri"/>
+              </w:rPr>
+            </w:pPr>
+            <w:r>
+              <w:rPr>
+                <w:rFonts w:ascii="Calibri" w:hAnsi="Calibri"/>
+              </w:rPr>
+              <w:t xml:space="preserve">Asimismo, el uso de herramientas integradas como cronogramas, temporizadores, fechas límite y la estructuración por </w:t>
+            </w:r>
+            <w:proofErr w:type="spellStart"/>
+            <w:r>
+              <w:rPr>
+                <w:rFonts w:ascii="Calibri" w:hAnsi="Calibri"/>
+              </w:rPr>
+              <w:t>sprints</w:t>
+            </w:r>
+            <w:proofErr w:type="spellEnd"/>
+            <w:r>
+              <w:rPr>
+                <w:rFonts w:ascii="Calibri" w:hAnsi="Calibri"/>
+              </w:rPr>
+              <w:t xml:space="preserve"> nos ha permitido optimizar la gestión del tiempo y mantener un avance ordenado. Por otra parte, la ejecución sistemática de ceremonias ágiles como las Sprint </w:t>
+            </w:r>
+            <w:proofErr w:type="spellStart"/>
+            <w:r>
+              <w:rPr>
+                <w:rFonts w:ascii="Calibri" w:hAnsi="Calibri"/>
+              </w:rPr>
+              <w:t>Planning</w:t>
+            </w:r>
+            <w:proofErr w:type="spellEnd"/>
+            <w:r>
+              <w:rPr>
+                <w:rFonts w:ascii="Calibri" w:hAnsi="Calibri"/>
+              </w:rPr>
+              <w:t xml:space="preserve"> y las Retrospectives ha sido clave para garantizar una planificación efectiva y una mejora continua en la dinámica de equipo.</w:t>
+            </w:r>
+          </w:p>
+          <w:p>
+            <w:pPr>
+              <w:rPr>
+                <w:rFonts w:ascii="Calibri" w:hAnsi="Calibri"/>
+                <w:color w:val="1F3864" w:themeColor="accent1" w:themeShade="80"/>
+              </w:rPr>
+            </w:pPr>
+            <w:r>
+              <w:rPr>
+                <w:rFonts w:ascii="Calibri" w:hAnsi="Calibri"/>
+              </w:rPr>
+              <w:lastRenderedPageBreak/>
+              <w:t>Hasta la fecha no se han presentado dificultades significativas que comprometan el desarrollo del plan de trabajo.</w:t>
+            </w:r>
           </w:p>
         </w:tc>
       </w:tr>
@@ -2753,7 +3834,6 @@
                 <w:rFonts w:ascii="Calibri" w:hAnsi="Calibri"/>
                 <w:color w:val="1F3864" w:themeColor="accent1" w:themeShade="80"/>
               </w:rPr>
-              <w:lastRenderedPageBreak/>
               <w:t xml:space="preserve">Actividades ajustadas o eliminadas: </w:t>
             </w:r>
             <w:r>
@@ -2875,65 +3955,186 @@
               <w:jc w:val="both"/>
               <w:rPr>
                 <w:rFonts w:ascii="Calibri" w:hAnsi="Calibri" w:cs="Arial"/>
-                <w:i/>
-                <w:color w:val="548DD4"/>
-                <w:sz w:val="20"/>
-                <w:szCs w:val="20"/>
-                <w:lang w:eastAsia="es-CL"/>
-              </w:rPr>
-            </w:pPr>
+                <w:iCs/>
+                <w:sz w:val="20"/>
+                <w:szCs w:val="20"/>
+                <w:lang w:eastAsia="es-CL"/>
+              </w:rPr>
+            </w:pPr>
+            <w:r>
+              <w:rPr>
+                <w:rFonts w:ascii="Calibri" w:hAnsi="Calibri" w:cs="Arial"/>
+                <w:iCs/>
+                <w:sz w:val="20"/>
+                <w:szCs w:val="20"/>
+                <w:lang w:eastAsia="es-CL"/>
+              </w:rPr>
+              <w:t>El plan de trabajo original no ha requerido ajustes estructurales ni eliminación de actividades, ya que el proyecto contó desde el inicio con una definición clara de los objetivos y del rumbo a seguir.</w:t>
+            </w:r>
           </w:p>
           <w:p>
             <w:pPr>
               <w:jc w:val="both"/>
               <w:rPr>
                 <w:rFonts w:ascii="Calibri" w:hAnsi="Calibri" w:cs="Arial"/>
-                <w:i/>
-                <w:color w:val="C00000"/>
-                <w:sz w:val="20"/>
-                <w:szCs w:val="20"/>
-                <w:lang w:eastAsia="es-CL"/>
-              </w:rPr>
-            </w:pPr>
-          </w:p>
-          <w:p>
-            <w:pPr>
+                <w:iCs/>
+                <w:sz w:val="20"/>
+                <w:szCs w:val="20"/>
+                <w:lang w:eastAsia="es-CL"/>
+              </w:rPr>
+            </w:pPr>
+            <w:r>
+              <w:rPr>
+                <w:rFonts w:ascii="Calibri" w:hAnsi="Calibri" w:cs="Arial"/>
+                <w:iCs/>
+                <w:sz w:val="20"/>
+                <w:szCs w:val="20"/>
+                <w:lang w:eastAsia="es-CL"/>
+              </w:rPr>
+              <w:t xml:space="preserve">Esta estabilidad ha sido posible gracias a los factores facilitadores mencionados anteriormente (la buena organización mediante tableros en </w:t>
+            </w:r>
+            <w:proofErr w:type="spellStart"/>
+            <w:r>
+              <w:rPr>
+                <w:rFonts w:ascii="Calibri" w:hAnsi="Calibri" w:cs="Arial"/>
+                <w:iCs/>
+                <w:sz w:val="20"/>
+                <w:szCs w:val="20"/>
+                <w:lang w:eastAsia="es-CL"/>
+              </w:rPr>
+              <w:t>ClickUp</w:t>
+            </w:r>
+            <w:proofErr w:type="spellEnd"/>
+            <w:r>
+              <w:rPr>
+                <w:rFonts w:ascii="Calibri" w:hAnsi="Calibri" w:cs="Arial"/>
+                <w:iCs/>
+                <w:sz w:val="20"/>
+                <w:szCs w:val="20"/>
+                <w:lang w:eastAsia="es-CL"/>
+              </w:rPr>
+              <w:t xml:space="preserve"> y la gestión por </w:t>
+            </w:r>
+            <w:proofErr w:type="spellStart"/>
+            <w:r>
+              <w:rPr>
+                <w:rFonts w:ascii="Calibri" w:hAnsi="Calibri" w:cs="Arial"/>
+                <w:iCs/>
+                <w:sz w:val="20"/>
+                <w:szCs w:val="20"/>
+                <w:lang w:eastAsia="es-CL"/>
+              </w:rPr>
+              <w:t>sprints</w:t>
+            </w:r>
+            <w:proofErr w:type="spellEnd"/>
+            <w:r>
+              <w:rPr>
+                <w:rFonts w:ascii="Calibri" w:hAnsi="Calibri" w:cs="Arial"/>
+                <w:iCs/>
+                <w:sz w:val="20"/>
+                <w:szCs w:val="20"/>
+                <w:lang w:eastAsia="es-CL"/>
+              </w:rPr>
+              <w:t xml:space="preserve">). No obstante, más allá de mantener el plan inicial, hemos incorporado de forma orgánica algunas tareas adicionales enfocadas en optimizar la calidad del desarrollo. Estas adiciones respondieron a necesidades técnicas puntuales para mejorar </w:t>
+            </w:r>
+            <w:r>
+              <w:rPr>
+                <w:rFonts w:ascii="Calibri" w:hAnsi="Calibri" w:cs="Arial"/>
+                <w:iCs/>
+                <w:sz w:val="20"/>
+                <w:szCs w:val="20"/>
+                <w:lang w:eastAsia="es-CL"/>
+              </w:rPr>
+              <w:t>las buenas prácticas</w:t>
+            </w:r>
+            <w:r>
+              <w:rPr>
+                <w:rFonts w:ascii="Calibri" w:hAnsi="Calibri" w:cs="Arial"/>
+                <w:iCs/>
+                <w:sz w:val="20"/>
+                <w:szCs w:val="20"/>
+                <w:lang w:eastAsia="es-CL"/>
+              </w:rPr>
+              <w:t>, tales como:</w:t>
+            </w:r>
+          </w:p>
+          <w:p>
+            <w:pPr>
+              <w:numPr>
+                <w:ilvl w:val="0"/>
+                <w:numId w:val="3"/>
+              </w:numPr>
               <w:jc w:val="both"/>
               <w:rPr>
                 <w:rFonts w:ascii="Calibri" w:hAnsi="Calibri" w:cs="Arial"/>
-                <w:i/>
-                <w:color w:val="548DD4"/>
-                <w:sz w:val="20"/>
-                <w:szCs w:val="20"/>
-                <w:lang w:eastAsia="es-CL"/>
-              </w:rPr>
-            </w:pPr>
-          </w:p>
-          <w:p>
-            <w:pPr>
+                <w:iCs/>
+                <w:sz w:val="20"/>
+                <w:szCs w:val="20"/>
+                <w:lang w:eastAsia="es-CL"/>
+              </w:rPr>
+            </w:pPr>
+            <w:r>
+              <w:rPr>
+                <w:rFonts w:ascii="Calibri" w:hAnsi="Calibri" w:cs="Arial"/>
+                <w:iCs/>
+                <w:sz w:val="20"/>
+                <w:szCs w:val="20"/>
+                <w:lang w:eastAsia="es-CL"/>
+              </w:rPr>
+              <w:t>La implementación de seguridad basada en tokens y contraseñas encriptadas.</w:t>
+            </w:r>
+          </w:p>
+          <w:p>
+            <w:pPr>
+              <w:numPr>
+                <w:ilvl w:val="0"/>
+                <w:numId w:val="3"/>
+              </w:numPr>
               <w:jc w:val="both"/>
               <w:rPr>
                 <w:rFonts w:ascii="Calibri" w:hAnsi="Calibri" w:cs="Arial"/>
-                <w:i/>
-                <w:color w:val="548DD4"/>
-                <w:sz w:val="20"/>
-                <w:szCs w:val="20"/>
-                <w:lang w:eastAsia="es-CL"/>
-              </w:rPr>
-            </w:pPr>
-          </w:p>
-          <w:p>
-            <w:pPr>
+                <w:iCs/>
+                <w:sz w:val="20"/>
+                <w:szCs w:val="20"/>
+                <w:lang w:eastAsia="es-CL"/>
+              </w:rPr>
+            </w:pPr>
+            <w:r>
+              <w:rPr>
+                <w:rFonts w:ascii="Calibri" w:hAnsi="Calibri" w:cs="Arial"/>
+                <w:iCs/>
+                <w:sz w:val="20"/>
+                <w:szCs w:val="20"/>
+                <w:lang w:eastAsia="es-CL"/>
+              </w:rPr>
+              <w:t>La refactorización de código para mantenerlo limpio y mantenible.</w:t>
+            </w:r>
+          </w:p>
+          <w:p>
+            <w:pPr>
+              <w:numPr>
+                <w:ilvl w:val="0"/>
+                <w:numId w:val="3"/>
+              </w:numPr>
               <w:jc w:val="both"/>
               <w:rPr>
                 <w:rFonts w:ascii="Calibri" w:hAnsi="Calibri" w:cs="Arial"/>
-                <w:i/>
-                <w:color w:val="548DD4"/>
-                <w:sz w:val="20"/>
-                <w:szCs w:val="20"/>
-                <w:lang w:eastAsia="es-CL"/>
-              </w:rPr>
-            </w:pPr>
+                <w:iCs/>
+                <w:sz w:val="20"/>
+                <w:szCs w:val="20"/>
+                <w:lang w:eastAsia="es-CL"/>
+              </w:rPr>
+            </w:pPr>
+            <w:r>
+              <w:rPr>
+                <w:rFonts w:ascii="Calibri" w:hAnsi="Calibri" w:cs="Arial"/>
+                <w:iCs/>
+                <w:sz w:val="20"/>
+                <w:szCs w:val="20"/>
+                <w:lang w:eastAsia="es-CL"/>
+              </w:rPr>
+              <w:t>La adaptación hacia una arquitectura modular que facilita la claridad y escalabilidad del software.</w:t>
+            </w:r>
           </w:p>
           <w:p>
             <w:pPr>
@@ -2947,19 +4148,38 @@
                 <w:lang w:eastAsia="es-CL"/>
               </w:rPr>
             </w:pPr>
-          </w:p>
-          <w:p>
-            <w:pPr>
-              <w:jc w:val="both"/>
-              <w:rPr>
-                <w:rFonts w:ascii="Calibri" w:hAnsi="Calibri" w:cs="Arial"/>
-                <w:i/>
-                <w:color w:val="548DD4"/>
-                <w:sz w:val="20"/>
-                <w:szCs w:val="20"/>
-                <w:lang w:eastAsia="es-CL"/>
-              </w:rPr>
-            </w:pPr>
+            <w:r>
+              <w:rPr>
+                <w:rFonts w:ascii="Calibri" w:hAnsi="Calibri" w:cs="Arial"/>
+                <w:iCs/>
+                <w:sz w:val="20"/>
+                <w:szCs w:val="20"/>
+                <w:lang w:eastAsia="es-CL"/>
+              </w:rPr>
+              <w:t xml:space="preserve">Estas incorporaciones se integraron de manera fluida en los </w:t>
+            </w:r>
+            <w:proofErr w:type="spellStart"/>
+            <w:r>
+              <w:rPr>
+                <w:rFonts w:ascii="Calibri" w:hAnsi="Calibri" w:cs="Arial"/>
+                <w:iCs/>
+                <w:sz w:val="20"/>
+                <w:szCs w:val="20"/>
+                <w:lang w:eastAsia="es-CL"/>
+              </w:rPr>
+              <w:t>sprints</w:t>
+            </w:r>
+            <w:proofErr w:type="spellEnd"/>
+            <w:r>
+              <w:rPr>
+                <w:rFonts w:ascii="Calibri" w:hAnsi="Calibri" w:cs="Arial"/>
+                <w:iCs/>
+                <w:sz w:val="20"/>
+                <w:szCs w:val="20"/>
+                <w:lang w:eastAsia="es-CL"/>
+              </w:rPr>
+              <w:t xml:space="preserve"> sin alterar el cumplimiento de los objetivos principales del proyecto APT</w:t>
+            </w:r>
           </w:p>
         </w:tc>
       </w:tr>
@@ -3151,7 +4371,31 @@
                 <w:szCs w:val="20"/>
                 <w:lang w:eastAsia="es-CL"/>
               </w:rPr>
-              <w:t xml:space="preserve"> de acuerdo a tu planificación</w:t>
+              <w:t xml:space="preserve"> </w:t>
+            </w:r>
+            <w:proofErr w:type="gramStart"/>
+            <w:r>
+              <w:rPr>
+                <w:rFonts w:ascii="Calibri" w:hAnsi="Calibri" w:cs="Arial"/>
+                <w:i/>
+                <w:color w:val="548DD4"/>
+                <w:sz w:val="20"/>
+                <w:szCs w:val="20"/>
+                <w:lang w:eastAsia="es-CL"/>
+              </w:rPr>
+              <w:t>de acuerdo a</w:t>
+            </w:r>
+            <w:proofErr w:type="gramEnd"/>
+            <w:r>
+              <w:rPr>
+                <w:rFonts w:ascii="Calibri" w:hAnsi="Calibri" w:cs="Arial"/>
+                <w:i/>
+                <w:color w:val="548DD4"/>
+                <w:sz w:val="20"/>
+                <w:szCs w:val="20"/>
+                <w:lang w:eastAsia="es-CL"/>
+              </w:rPr>
+              <w:t xml:space="preserve"> tu planificación</w:t>
             </w:r>
             <w:r>
               <w:rPr>
@@ -3203,78 +4447,128 @@
               <w:jc w:val="both"/>
               <w:rPr>
                 <w:rFonts w:ascii="Calibri" w:hAnsi="Calibri" w:cs="Arial"/>
-                <w:i/>
-                <w:color w:val="548DD4"/>
-                <w:sz w:val="20"/>
-                <w:szCs w:val="20"/>
-                <w:lang w:eastAsia="es-CL"/>
-              </w:rPr>
-            </w:pPr>
+                <w:iCs/>
+                <w:sz w:val="20"/>
+                <w:szCs w:val="20"/>
+                <w:lang w:eastAsia="es-CL"/>
+              </w:rPr>
+            </w:pPr>
+            <w:r>
+              <w:rPr>
+                <w:rFonts w:ascii="Calibri" w:hAnsi="Calibri" w:cs="Arial"/>
+                <w:iCs/>
+                <w:sz w:val="20"/>
+                <w:szCs w:val="20"/>
+                <w:lang w:eastAsia="es-CL"/>
+              </w:rPr>
+              <w:t xml:space="preserve">A la fecha, la totalidad de las actividades principales y requerimientos críticos (funcionalidades </w:t>
+            </w:r>
+            <w:proofErr w:type="spellStart"/>
+            <w:r>
+              <w:rPr>
+                <w:rFonts w:ascii="Calibri" w:hAnsi="Calibri" w:cs="Arial"/>
+                <w:iCs/>
+                <w:sz w:val="20"/>
+                <w:szCs w:val="20"/>
+                <w:lang w:eastAsia="es-CL"/>
+              </w:rPr>
+              <w:t>core</w:t>
+            </w:r>
+            <w:proofErr w:type="spellEnd"/>
+            <w:r>
+              <w:rPr>
+                <w:rFonts w:ascii="Calibri" w:hAnsi="Calibri" w:cs="Arial"/>
+                <w:iCs/>
+                <w:sz w:val="20"/>
+                <w:szCs w:val="20"/>
+                <w:lang w:eastAsia="es-CL"/>
+              </w:rPr>
+              <w:t>) planificados para el Proyecto APT han sido completados en su totalidad y dentro de los plazos establecidos.</w:t>
+            </w:r>
           </w:p>
           <w:p>
             <w:pPr>
               <w:jc w:val="both"/>
               <w:rPr>
                 <w:rFonts w:ascii="Calibri" w:hAnsi="Calibri" w:cs="Arial"/>
-                <w:i/>
-                <w:color w:val="548DD4"/>
-                <w:sz w:val="20"/>
-                <w:szCs w:val="20"/>
-                <w:lang w:eastAsia="es-CL"/>
-              </w:rPr>
-            </w:pPr>
+                <w:iCs/>
+                <w:sz w:val="20"/>
+                <w:szCs w:val="20"/>
+                <w:lang w:eastAsia="es-CL"/>
+              </w:rPr>
+            </w:pPr>
+            <w:r>
+              <w:rPr>
+                <w:rFonts w:ascii="Calibri" w:hAnsi="Calibri" w:cs="Arial"/>
+                <w:iCs/>
+                <w:sz w:val="20"/>
+                <w:szCs w:val="20"/>
+                <w:lang w:eastAsia="es-CL"/>
+              </w:rPr>
+              <w:t>En el sprint más reciente, únicamente han quedado pendientes algunas tareas secundarias de refinamiento de la interfaz de usuario (UI/UX), tales como mejoras visuales, consistencia estilística y optimizaciones estéticas. Estas actividades fueron reprogramadas para el siguiente sprint debido a que no comprometen la funcionalidad ni el objetivo general del proyecto.</w:t>
+            </w:r>
           </w:p>
           <w:p>
             <w:pPr>
               <w:jc w:val="both"/>
               <w:rPr>
                 <w:rFonts w:ascii="Calibri" w:hAnsi="Calibri" w:cs="Arial"/>
-                <w:i/>
-                <w:color w:val="548DD4"/>
-                <w:sz w:val="20"/>
-                <w:szCs w:val="20"/>
-                <w:lang w:eastAsia="es-CL"/>
-              </w:rPr>
-            </w:pPr>
-          </w:p>
-          <w:p>
-            <w:pPr>
-              <w:jc w:val="both"/>
-              <w:rPr>
-                <w:rFonts w:ascii="Calibri" w:hAnsi="Calibri" w:cs="Arial"/>
-                <w:i/>
-                <w:color w:val="548DD4"/>
-                <w:sz w:val="20"/>
-                <w:szCs w:val="20"/>
-                <w:lang w:eastAsia="es-CL"/>
-              </w:rPr>
-            </w:pPr>
-          </w:p>
-          <w:p>
-            <w:pPr>
-              <w:jc w:val="both"/>
-              <w:rPr>
-                <w:rFonts w:ascii="Calibri" w:hAnsi="Calibri" w:cs="Arial"/>
-                <w:i/>
-                <w:color w:val="548DD4"/>
-                <w:sz w:val="20"/>
-                <w:szCs w:val="20"/>
-                <w:lang w:eastAsia="es-CL"/>
-              </w:rPr>
-            </w:pPr>
-          </w:p>
-          <w:p>
-            <w:pPr>
-              <w:jc w:val="both"/>
-              <w:rPr>
-                <w:rFonts w:ascii="Calibri" w:hAnsi="Calibri" w:cs="Arial"/>
-                <w:i/>
-                <w:color w:val="548DD4"/>
-                <w:sz w:val="20"/>
-                <w:szCs w:val="20"/>
-                <w:lang w:eastAsia="es-CL"/>
-              </w:rPr>
-            </w:pPr>
+                <w:iCs/>
+                <w:sz w:val="20"/>
+                <w:szCs w:val="20"/>
+                <w:lang w:eastAsia="es-CL"/>
+              </w:rPr>
+            </w:pPr>
+            <w:r>
+              <w:rPr>
+                <w:rFonts w:ascii="Calibri" w:hAnsi="Calibri" w:cs="Arial"/>
+                <w:iCs/>
+                <w:sz w:val="20"/>
+                <w:szCs w:val="20"/>
+                <w:lang w:eastAsia="es-CL"/>
+              </w:rPr>
+              <w:t xml:space="preserve">Al tratarse de tareas de valor </w:t>
+            </w:r>
+            <w:r>
+              <w:rPr>
+                <w:rFonts w:ascii="Calibri" w:hAnsi="Calibri" w:cs="Arial"/>
+                <w:iCs/>
+                <w:sz w:val="20"/>
+                <w:szCs w:val="20"/>
+                <w:lang w:eastAsia="es-CL"/>
+              </w:rPr>
+              <w:t>agregado,</w:t>
+            </w:r>
+            <w:r>
+              <w:rPr>
+                <w:rFonts w:ascii="Calibri" w:hAnsi="Calibri" w:cs="Arial"/>
+                <w:iCs/>
+                <w:sz w:val="20"/>
+                <w:szCs w:val="20"/>
+                <w:lang w:eastAsia="es-CL"/>
+              </w:rPr>
+              <w:t xml:space="preserve"> pero no críticas, se </w:t>
+            </w:r>
+            <w:r>
+              <w:rPr>
+                <w:rFonts w:ascii="Calibri" w:hAnsi="Calibri" w:cs="Arial"/>
+                <w:iCs/>
+                <w:sz w:val="20"/>
+                <w:szCs w:val="20"/>
+                <w:lang w:eastAsia="es-CL"/>
+              </w:rPr>
+              <w:t>abordarán</w:t>
+            </w:r>
+            <w:r>
+              <w:rPr>
+                <w:rFonts w:ascii="Calibri" w:hAnsi="Calibri" w:cs="Arial"/>
+                <w:iCs/>
+                <w:sz w:val="20"/>
+                <w:szCs w:val="20"/>
+                <w:lang w:eastAsia="es-CL"/>
+              </w:rPr>
+              <w:t xml:space="preserve"> durante el último ciclo de desarrollo como parte de la fase final de pulido del producto. Esto garantiza que la dirección general del proyecto se mantenga firme y los entregables principales continúen 100% al día.</w:t>
+            </w:r>
           </w:p>
           <w:p>
             <w:pPr>
@@ -3300,7 +4594,7 @@
       </w:pPr>
     </w:p>
     <w:sectPr>
-      <w:headerReference w:type="default" r:id="rId10"/>
+      <w:headerReference w:type="default" r:id="rId11"/>
       <w:pgSz w:w="11906" w:h="16838"/>
       <w:pgMar w:top="1417" w:right="1701" w:bottom="1417" w:left="1701" w:header="708" w:footer="708" w:gutter="0"/>
       <w:cols w:space="708"/>
@@ -3311,7 +4605,7 @@
 </file>
 
 <file path=word/endnotes.xml><?xml version="1.0" encoding="utf-8"?>
-<w:endnotes xmlns:wpc="http://schemas.microsoft.com/office/word/2010/wordprocessingCanvas" xmlns:cx="http://schemas.microsoft.com/office/drawing/2014/chartex" xmlns:mc="http://schemas.openxmlformats.org/markup-compatibility/2006" xmlns:o="urn:schemas-microsoft-com:office:office" xmlns:r="http://schemas.openxmlformats.org/officeDocument/2006/relationships" xmlns:m="http://schemas.openxmlformats.org/officeDocument/2006/math" xmlns:v="urn:schemas-microsoft-com:vml" xmlns:wp14="http://schemas.microsoft.com/office/word/2010/wordprocessingDrawing" xmlns:wp="http://schemas.openxmlformats.org/drawingml/2006/wordprocessingDrawing" xmlns:w10="urn:schemas-microsoft-com:office:word" xmlns:w="http://schemas.openxmlformats.org/wordprocessingml/2006/main" xmlns:w14="http://schemas.microsoft.com/office/word/2010/wordml" xmlns:w15="http://schemas.microsoft.com/office/word/2012/wordml" xmlns:w16se="http://schemas.microsoft.com/office/word/2015/wordml/symex" xmlns:wpg="http://schemas.microsoft.com/office/word/2010/wordprocessingGroup" xmlns:wpi="http://schemas.microsoft.com/office/word/2010/wordprocessingInk" xmlns:wne="http://schemas.microsoft.com/office/word/2006/wordml" xmlns:wps="http://schemas.microsoft.com/office/word/2010/wordprocessingShape" mc:Ignorable="w14 w15 w16se wp14">
+<w:endnotes xmlns:wpc="http://schemas.microsoft.com/office/word/2010/wordprocessingCanvas" xmlns:cx="http://schemas.microsoft.com/office/drawing/2014/chartex" xmlns:cx1="http://schemas.microsoft.com/office/drawing/2015/9/8/chartex" xmlns:cx2="http://schemas.microsoft.com/office/drawing/2015/10/21/chartex" xmlns:cx3="http://schemas.microsoft.com/office/drawing/2016/5/9/chartex" xmlns:cx4="http://schemas.microsoft.com/office/drawing/2016/5/10/chartex" xmlns:cx5="http://schemas.microsoft.com/office/drawing/2016/5/11/chartex" xmlns:cx6="http://schemas.microsoft.com/office/drawing/2016/5/12/chartex" xmlns:cx7="http://schemas.microsoft.com/office/drawing/2016/5/13/chartex" xmlns:cx8="http://schemas.microsoft.com/office/drawing/2016/5/14/chartex" xmlns:mc="http://schemas.openxmlformats.org/markup-compatibility/2006" xmlns:aink="http://schemas.microsoft.com/office/drawing/2016/ink" xmlns:am3d="http://schemas.microsoft.com/office/drawing/2017/model3d" xmlns:o="urn:schemas-microsoft-com:office:office" xmlns:oel="http://schemas.microsoft.com/office/2019/extlst" xmlns:r="http://schemas.openxmlformats.org/officeDocument/2006/relationships" xmlns:m="http://schemas.openxmlformats.org/officeDocument/2006/math" xmlns:v="urn:schemas-microsoft-com:vml" xmlns:wp14="http://schemas.microsoft.com/office/word/2010/wordprocessingDrawing" xmlns:wp="http://schemas.openxmlformats.org/drawingml/2006/wordprocessingDrawing" xmlns:w10="urn:schemas-microsoft-com:office:word" xmlns:w="http://schemas.openxmlformats.org/wordprocessingml/2006/main" xmlns:w14="http://schemas.microsoft.com/office/word/2010/wordml" xmlns:w15="http://schemas.microsoft.com/office/word/2012/wordml" xmlns:w16cex="http://schemas.microsoft.com/office/word/2018/wordml/cex" xmlns:w16cid="http://schemas.microsoft.com/office/word/2016/wordml/cid" xmlns:w16="http://schemas.microsoft.com/office/word/2018/wordml" xmlns:w16du="http://schemas.microsoft.com/office/word/2023/wordml/word16du" xmlns:w16sdtdh="http://schemas.microsoft.com/office/word/2020/wordml/sdtdatahash" xmlns:w16sdtfl="http://schemas.microsoft.com/office/word/2024/wordml/sdtformatlock" xmlns:w16se="http://schemas.microsoft.com/office/word/2015/wordml/symex" xmlns:wpg="http://schemas.microsoft.com/office/word/2010/wordprocessingGroup" xmlns:wpi="http://schemas.microsoft.com/office/word/2010/wordprocessingInk" xmlns:wne="http://schemas.microsoft.com/office/word/2006/wordml" xmlns:wps="http://schemas.microsoft.com/office/word/2010/wordprocessingShape" mc:Ignorable="w14 w15 w16se w16cid w16 w16cex w16sdtdh w16sdtfl w16du wp14">
   <w:endnote w:type="separator" w:id="-1">
     <w:p>
       <w:pPr>
@@ -3336,7 +4630,7 @@
 </file>
 
 <file path=word/footnotes.xml><?xml version="1.0" encoding="utf-8"?>
-<w:footnotes xmlns:wpc="http://schemas.microsoft.com/office/word/2010/wordprocessingCanvas" xmlns:cx="http://schemas.microsoft.com/office/drawing/2014/chartex" xmlns:mc="http://schemas.openxmlformats.org/markup-compatibility/2006" xmlns:o="urn:schemas-microsoft-com:office:office" xmlns:r="http://schemas.openxmlformats.org/officeDocument/2006/relationships" xmlns:m="http://schemas.openxmlformats.org/officeDocument/2006/math" xmlns:v="urn:schemas-microsoft-com:vml" xmlns:wp14="http://schemas.microsoft.com/office/word/2010/wordprocessingDrawing" xmlns:wp="http://schemas.openxmlformats.org/drawingml/2006/wordprocessingDrawing" xmlns:w10="urn:schemas-microsoft-com:office:word" xmlns:w="http://schemas.openxmlformats.org/wordprocessingml/2006/main" xmlns:w14="http://schemas.microsoft.com/office/word/2010/wordml" xmlns:w15="http://schemas.microsoft.com/office/word/2012/wordml" xmlns:w16se="http://schemas.microsoft.com/office/word/2015/wordml/symex" xmlns:wpg="http://schemas.microsoft.com/office/word/2010/wordprocessingGroup" xmlns:wpi="http://schemas.microsoft.com/office/word/2010/wordprocessingInk" xmlns:wne="http://schemas.microsoft.com/office/word/2006/wordml" xmlns:wps="http://schemas.microsoft.com/office/word/2010/wordprocessingShape" mc:Ignorable="w14 w15 w16se wp14">
+<w:footnotes xmlns:wpc="http://schemas.microsoft.com/office/word/2010/wordprocessingCanvas" xmlns:cx="http://schemas.microsoft.com/office/drawing/2014/chartex" xmlns:cx1="http://schemas.microsoft.com/office/drawing/2015/9/8/chartex" xmlns:cx2="http://schemas.microsoft.com/office/drawing/2015/10/21/chartex" xmlns:cx3="http://schemas.microsoft.com/office/drawing/2016/5/9/chartex" xmlns:cx4="http://schemas.microsoft.com/office/drawing/2016/5/10/chartex" xmlns:cx5="http://schemas.microsoft.com/office/drawing/2016/5/11/chartex" xmlns:cx6="http://schemas.microsoft.com/office/drawing/2016/5/12/chartex" xmlns:cx7="http://schemas.microsoft.com/office/drawing/2016/5/13/chartex" xmlns:cx8="http://schemas.microsoft.com/office/drawing/2016/5/14/chartex" xmlns:mc="http://schemas.openxmlformats.org/markup-compatibility/2006" xmlns:aink="http://schemas.microsoft.com/office/drawing/2016/ink" xmlns:am3d="http://schemas.microsoft.com/office/drawing/2017/model3d" xmlns:o="urn:schemas-microsoft-com:office:office" xmlns:oel="http://schemas.microsoft.com/office/2019/extlst" xmlns:r="http://schemas.openxmlformats.org/officeDocument/2006/relationships" xmlns:m="http://schemas.openxmlformats.org/officeDocument/2006/math" xmlns:v="urn:schemas-microsoft-com:vml" xmlns:wp14="http://schemas.microsoft.com/office/word/2010/wordprocessingDrawing" xmlns:wp="http://schemas.openxmlformats.org/drawingml/2006/wordprocessingDrawing" xmlns:w10="urn:schemas-microsoft-com:office:word" xmlns:w="http://schemas.openxmlformats.org/wordprocessingml/2006/main" xmlns:w14="http://schemas.microsoft.com/office/word/2010/wordml" xmlns:w15="http://schemas.microsoft.com/office/word/2012/wordml" xmlns:w16cex="http://schemas.microsoft.com/office/word/2018/wordml/cex" xmlns:w16cid="http://schemas.microsoft.com/office/word/2016/wordml/cid" xmlns:w16="http://schemas.microsoft.com/office/word/2018/wordml" xmlns:w16du="http://schemas.microsoft.com/office/word/2023/wordml/word16du" xmlns:w16sdtdh="http://schemas.microsoft.com/office/word/2020/wordml/sdtdatahash" xmlns:w16sdtfl="http://schemas.microsoft.com/office/word/2024/wordml/sdtformatlock" xmlns:w16se="http://schemas.microsoft.com/office/word/2015/wordml/symex" xmlns:wpg="http://schemas.microsoft.com/office/word/2010/wordprocessingGroup" xmlns:wpi="http://schemas.microsoft.com/office/word/2010/wordprocessingInk" xmlns:wne="http://schemas.microsoft.com/office/word/2006/wordml" xmlns:wps="http://schemas.microsoft.com/office/word/2010/wordprocessingShape" mc:Ignorable="w14 w15 w16se w16cid w16 w16cex w16sdtdh w16sdtfl w16du wp14">
   <w:footnote w:type="separator" w:id="-1">
     <w:p>
       <w:pPr>
@@ -3419,7 +4713,7 @@
 </file>
 
 <file path=word/header1.xml><?xml version="1.0" encoding="utf-8"?>
-<w:hdr xmlns:wpc="http://schemas.microsoft.com/office/word/2010/wordprocessingCanvas" xmlns:cx="http://schemas.microsoft.com/office/drawing/2014/chartex" xmlns:mc="http://schemas.openxmlformats.org/markup-compatibility/2006" xmlns:o="urn:schemas-microsoft-com:office:office" xmlns:r="http://schemas.openxmlformats.org/officeDocument/2006/relationships" xmlns:m="http://schemas.openxmlformats.org/officeDocument/2006/math" xmlns:v="urn:schemas-microsoft-com:vml" xmlns:wp14="http://schemas.microsoft.com/office/word/2010/wordprocessingDrawing" xmlns:wp="http://schemas.openxmlformats.org/drawingml/2006/wordprocessingDrawing" xmlns:w10="urn:schemas-microsoft-com:office:word" xmlns:w="http://schemas.openxmlformats.org/wordprocessingml/2006/main" xmlns:w14="http://schemas.microsoft.com/office/word/2010/wordml" xmlns:w15="http://schemas.microsoft.com/office/word/2012/wordml" xmlns:w16se="http://schemas.microsoft.com/office/word/2015/wordml/symex" xmlns:wpg="http://schemas.microsoft.com/office/word/2010/wordprocessingGroup" xmlns:wpi="http://schemas.microsoft.com/office/word/2010/wordprocessingInk" xmlns:wne="http://schemas.microsoft.com/office/word/2006/wordml" xmlns:wps="http://schemas.microsoft.com/office/word/2010/wordprocessingShape" mc:Ignorable="w14 w15 w16se wp14">
+<w:hdr xmlns:wpc="http://schemas.microsoft.com/office/word/2010/wordprocessingCanvas" xmlns:cx="http://schemas.microsoft.com/office/drawing/2014/chartex" xmlns:cx1="http://schemas.microsoft.com/office/drawing/2015/9/8/chartex" xmlns:cx2="http://schemas.microsoft.com/office/drawing/2015/10/21/chartex" xmlns:cx3="http://schemas.microsoft.com/office/drawing/2016/5/9/chartex" xmlns:cx4="http://schemas.microsoft.com/office/drawing/2016/5/10/chartex" xmlns:cx5="http://schemas.microsoft.com/office/drawing/2016/5/11/chartex" xmlns:cx6="http://schemas.microsoft.com/office/drawing/2016/5/12/chartex" xmlns:cx7="http://schemas.microsoft.com/office/drawing/2016/5/13/chartex" xmlns:cx8="http://schemas.microsoft.com/office/drawing/2016/5/14/chartex" xmlns:mc="http://schemas.openxmlformats.org/markup-compatibility/2006" xmlns:aink="http://schemas.microsoft.com/office/drawing/2016/ink" xmlns:am3d="http://schemas.microsoft.com/office/drawing/2017/model3d" xmlns:o="urn:schemas-microsoft-com:office:office" xmlns:oel="http://schemas.microsoft.com/office/2019/extlst" xmlns:r="http://schemas.openxmlformats.org/officeDocument/2006/relationships" xmlns:m="http://schemas.openxmlformats.org/officeDocument/2006/math" xmlns:v="urn:schemas-microsoft-com:vml" xmlns:wp14="http://schemas.microsoft.com/office/word/2010/wordprocessingDrawing" xmlns:wp="http://schemas.openxmlformats.org/drawingml/2006/wordprocessingDrawing" xmlns:w10="urn:schemas-microsoft-com:office:word" xmlns:w="http://schemas.openxmlformats.org/wordprocessingml/2006/main" xmlns:w14="http://schemas.microsoft.com/office/word/2010/wordml" xmlns:w15="http://schemas.microsoft.com/office/word/2012/wordml" xmlns:w16cex="http://schemas.microsoft.com/office/word/2018/wordml/cex" xmlns:w16cid="http://schemas.microsoft.com/office/word/2016/wordml/cid" xmlns:w16="http://schemas.microsoft.com/office/word/2018/wordml" xmlns:w16du="http://schemas.microsoft.com/office/word/2023/wordml/word16du" xmlns:w16sdtdh="http://schemas.microsoft.com/office/word/2020/wordml/sdtdatahash" xmlns:w16sdtfl="http://schemas.microsoft.com/office/word/2024/wordml/sdtformatlock" xmlns:w16se="http://schemas.microsoft.com/office/word/2015/wordml/symex" xmlns:wpg="http://schemas.microsoft.com/office/word/2010/wordprocessingGroup" xmlns:wpi="http://schemas.microsoft.com/office/word/2010/wordprocessingInk" xmlns:wne="http://schemas.microsoft.com/office/word/2006/wordml" xmlns:wps="http://schemas.microsoft.com/office/word/2010/wordprocessingShape" mc:Ignorable="w14 w15 w16se w16cid w16 w16cex w16sdtdh w16sdtfl w16du wp14">
   <w:tbl>
     <w:tblPr>
       <w:tblStyle w:val="Tablaconcuadrcula1"/>
@@ -3644,8 +4938,121 @@
 </file>
 
 <file path=word/numbering.xml><?xml version="1.0" encoding="utf-8"?>
-<w:numbering xmlns:wpc="http://schemas.microsoft.com/office/word/2010/wordprocessingCanvas" xmlns:cx="http://schemas.microsoft.com/office/drawing/2014/chartex" xmlns:mc="http://schemas.openxmlformats.org/markup-compatibility/2006" xmlns:o="urn:schemas-microsoft-com:office:office" xmlns:r="http://schemas.openxmlformats.org/officeDocument/2006/relationships" xmlns:m="http://schemas.openxmlformats.org/officeDocument/2006/math" xmlns:v="urn:schemas-microsoft-com:vml" xmlns:wp14="http://schemas.microsoft.com/office/word/2010/wordprocessingDrawing" xmlns:wp="http://schemas.openxmlformats.org/drawingml/2006/wordprocessingDrawing" xmlns:w10="urn:schemas-microsoft-com:office:word" xmlns:w="http://schemas.openxmlformats.org/wordprocessingml/2006/main" xmlns:w14="http://schemas.microsoft.com/office/word/2010/wordml" xmlns:w15="http://schemas.microsoft.com/office/word/2012/wordml" xmlns:w16se="http://schemas.microsoft.com/office/word/2015/wordml/symex" xmlns:wpg="http://schemas.microsoft.com/office/word/2010/wordprocessingGroup" xmlns:wpi="http://schemas.microsoft.com/office/word/2010/wordprocessingInk" xmlns:wne="http://schemas.microsoft.com/office/word/2006/wordml" xmlns:wps="http://schemas.microsoft.com/office/word/2010/wordprocessingShape" mc:Ignorable="w14 w15 w16se wp14">
+<w:numbering xmlns:wpc="http://schemas.microsoft.com/office/word/2010/wordprocessingCanvas" xmlns:cx="http://schemas.microsoft.com/office/drawing/2014/chartex" xmlns:cx1="http://schemas.microsoft.com/office/drawing/2015/9/8/chartex" xmlns:cx2="http://schemas.microsoft.com/office/drawing/2015/10/21/chartex" xmlns:cx3="http://schemas.microsoft.com/office/drawing/2016/5/9/chartex" xmlns:cx4="http://schemas.microsoft.com/office/drawing/2016/5/10/chartex" xmlns:cx5="http://schemas.microsoft.com/office/drawing/2016/5/11/chartex" xmlns:cx6="http://schemas.microsoft.com/office/drawing/2016/5/12/chartex" xmlns:cx7="http://schemas.microsoft.com/office/drawing/2016/5/13/chartex" xmlns:cx8="http://schemas.microsoft.com/office/drawing/2016/5/14/chartex" xmlns:mc="http://schemas.openxmlformats.org/markup-compatibility/2006" xmlns:aink="http://schemas.microsoft.com/office/drawing/2016/ink" xmlns:am3d="http://schemas.microsoft.com/office/drawing/2017/model3d" xmlns:o="urn:schemas-microsoft-com:office:office" xmlns:oel="http://schemas.microsoft.com/office/2019/extlst" xmlns:r="http://schemas.openxmlformats.org/officeDocument/2006/relationships" xmlns:m="http://schemas.openxmlformats.org/officeDocument/2006/math" xmlns:v="urn:schemas-microsoft-com:vml" xmlns:wp14="http://schemas.microsoft.com/office/word/2010/wordprocessingDrawing" xmlns:wp="http://schemas.openxmlformats.org/drawingml/2006/wordprocessingDrawing" xmlns:w10="urn:schemas-microsoft-com:office:word" xmlns:w="http://schemas.openxmlformats.org/wordprocessingml/2006/main" xmlns:w14="http://schemas.microsoft.com/office/word/2010/wordml" xmlns:w15="http://schemas.microsoft.com/office/word/2012/wordml" xmlns:w16cex="http://schemas.microsoft.com/office/word/2018/wordml/cex" xmlns:w16cid="http://schemas.microsoft.com/office/word/2016/wordml/cid" xmlns:w16="http://schemas.microsoft.com/office/word/2018/wordml" xmlns:w16du="http://schemas.microsoft.com/office/word/2023/wordml/word16du" xmlns:w16sdtdh="http://schemas.microsoft.com/office/word/2020/wordml/sdtdatahash" xmlns:w16sdtfl="http://schemas.microsoft.com/office/word/2024/wordml/sdtformatlock" xmlns:w16se="http://schemas.microsoft.com/office/word/2015/wordml/symex" xmlns:wpg="http://schemas.microsoft.com/office/word/2010/wordprocessingGroup" xmlns:wpi="http://schemas.microsoft.com/office/word/2010/wordprocessingInk" xmlns:wne="http://schemas.microsoft.com/office/word/2006/wordml" xmlns:wps="http://schemas.microsoft.com/office/word/2010/wordprocessingShape" mc:Ignorable="w14 w15 w16se w16cid w16 w16cex w16sdtdh w16sdtfl w16du wp14">
   <w:abstractNum w:abstractNumId="0" w15:restartNumberingAfterBreak="0">
+    <w:nsid w:val="2CD534CD"/>
+    <w:multiLevelType w:val="multilevel"/>
+    <w:tmpl w:val="B086B216"/>
+    <w:lvl w:ilvl="0">
+      <w:start w:val="1"/>
+      <w:numFmt w:val="decimal"/>
+      <w:lvlText w:val="%1."/>
+      <w:lvlJc w:val="left"/>
+      <w:pPr>
+        <w:tabs>
+          <w:tab w:val="num" w:pos="720"/>
+        </w:tabs>
+        <w:ind w:left="720" w:hanging="360"/>
+      </w:pPr>
+    </w:lvl>
+    <w:lvl w:ilvl="1" w:tentative="1">
+      <w:start w:val="1"/>
+      <w:numFmt w:val="decimal"/>
+      <w:lvlText w:val="%2."/>
+      <w:lvlJc w:val="left"/>
+      <w:pPr>
+        <w:tabs>
+          <w:tab w:val="num" w:pos="1440"/>
+        </w:tabs>
+        <w:ind w:left="1440" w:hanging="360"/>
+      </w:pPr>
+    </w:lvl>
+    <w:lvl w:ilvl="2" w:tentative="1">
+      <w:start w:val="1"/>
+      <w:numFmt w:val="decimal"/>
+      <w:lvlText w:val="%3."/>
+      <w:lvlJc w:val="left"/>
+      <w:pPr>
+        <w:tabs>
+          <w:tab w:val="num" w:pos="2160"/>
+        </w:tabs>
+        <w:ind w:left="2160" w:hanging="360"/>
+      </w:pPr>
+    </w:lvl>
+    <w:lvl w:ilvl="3" w:tentative="1">
+      <w:start w:val="1"/>
+      <w:numFmt w:val="decimal"/>
+      <w:lvlText w:val="%4."/>
+      <w:lvlJc w:val="left"/>
+      <w:pPr>
+        <w:tabs>
+          <w:tab w:val="num" w:pos="2880"/>
+        </w:tabs>
+        <w:ind w:left="2880" w:hanging="360"/>
+      </w:pPr>
+    </w:lvl>
+    <w:lvl w:ilvl="4" w:tentative="1">
+      <w:start w:val="1"/>
+      <w:numFmt w:val="decimal"/>
+      <w:lvlText w:val="%5."/>
+      <w:lvlJc w:val="left"/>
+      <w:pPr>
+        <w:tabs>
+          <w:tab w:val="num" w:pos="3600"/>
+        </w:tabs>
+        <w:ind w:left="3600" w:hanging="360"/>
+      </w:pPr>
+    </w:lvl>
+    <w:lvl w:ilvl="5" w:tentative="1">
+      <w:start w:val="1"/>
+      <w:numFmt w:val="decimal"/>
+      <w:lvlText w:val="%6."/>
+      <w:lvlJc w:val="left"/>
+      <w:pPr>
+        <w:tabs>
+          <w:tab w:val="num" w:pos="4320"/>
+        </w:tabs>
+        <w:ind w:left="4320" w:hanging="360"/>
+      </w:pPr>
+    </w:lvl>
+    <w:lvl w:ilvl="6" w:tentative="1">
+      <w:start w:val="1"/>
+      <w:numFmt w:val="decimal"/>
+      <w:lvlText w:val="%7."/>
+      <w:lvlJc w:val="left"/>
+      <w:pPr>
+        <w:tabs>
+          <w:tab w:val="num" w:pos="5040"/>
+        </w:tabs>
+        <w:ind w:left="5040" w:hanging="360"/>
+      </w:pPr>
+    </w:lvl>
+    <w:lvl w:ilvl="7" w:tentative="1">
+      <w:start w:val="1"/>
+      <w:numFmt w:val="decimal"/>
+      <w:lvlText w:val="%8."/>
+      <w:lvlJc w:val="left"/>
+      <w:pPr>
+        <w:tabs>
+          <w:tab w:val="num" w:pos="5760"/>
+        </w:tabs>
+        <w:ind w:left="5760" w:hanging="360"/>
+      </w:pPr>
+    </w:lvl>
+    <w:lvl w:ilvl="8" w:tentative="1">
+      <w:start w:val="1"/>
+      <w:numFmt w:val="decimal"/>
+      <w:lvlText w:val="%9."/>
+      <w:lvlJc w:val="left"/>
+      <w:pPr>
+        <w:tabs>
+          <w:tab w:val="num" w:pos="6480"/>
+        </w:tabs>
+        <w:ind w:left="6480" w:hanging="360"/>
+      </w:pPr>
+    </w:lvl>
+  </w:abstractNum>
+  <w:abstractNum w:abstractNumId="1" w15:restartNumberingAfterBreak="0">
     <w:nsid w:val="2FFD4C7F"/>
     <w:multiLevelType w:val="multilevel"/>
     <w:tmpl w:val="CAF0F936"/>
@@ -3766,14 +5173,321 @@
       </w:rPr>
     </w:lvl>
   </w:abstractNum>
-  <w:num w:numId="1">
+  <w:abstractNum w:abstractNumId="2" w15:restartNumberingAfterBreak="0">
+    <w:nsid w:val="57AF2E80"/>
+    <w:multiLevelType w:val="multilevel"/>
+    <w:tmpl w:val="3C70F9C4"/>
+    <w:lvl w:ilvl="0">
+      <w:start w:val="1"/>
+      <w:numFmt w:val="bullet"/>
+      <w:lvlText w:val=""/>
+      <w:lvlJc w:val="left"/>
+      <w:pPr>
+        <w:tabs>
+          <w:tab w:val="num" w:pos="720"/>
+        </w:tabs>
+        <w:ind w:left="720" w:hanging="360"/>
+      </w:pPr>
+      <w:rPr>
+        <w:rFonts w:ascii="Symbol" w:hAnsi="Symbol" w:hint="default"/>
+        <w:sz w:val="20"/>
+      </w:rPr>
+    </w:lvl>
+    <w:lvl w:ilvl="1" w:tentative="1">
+      <w:start w:val="1"/>
+      <w:numFmt w:val="bullet"/>
+      <w:lvlText w:val=""/>
+      <w:lvlJc w:val="left"/>
+      <w:pPr>
+        <w:tabs>
+          <w:tab w:val="num" w:pos="1440"/>
+        </w:tabs>
+        <w:ind w:left="1440" w:hanging="360"/>
+      </w:pPr>
+      <w:rPr>
+        <w:rFonts w:ascii="Symbol" w:hAnsi="Symbol" w:hint="default"/>
+        <w:sz w:val="20"/>
+      </w:rPr>
+    </w:lvl>
+    <w:lvl w:ilvl="2" w:tentative="1">
+      <w:start w:val="1"/>
+      <w:numFmt w:val="bullet"/>
+      <w:lvlText w:val=""/>
+      <w:lvlJc w:val="left"/>
+      <w:pPr>
+        <w:tabs>
+          <w:tab w:val="num" w:pos="2160"/>
+        </w:tabs>
+        <w:ind w:left="2160" w:hanging="360"/>
+      </w:pPr>
+      <w:rPr>
+        <w:rFonts w:ascii="Symbol" w:hAnsi="Symbol" w:hint="default"/>
+        <w:sz w:val="20"/>
+      </w:rPr>
+    </w:lvl>
+    <w:lvl w:ilvl="3" w:tentative="1">
+      <w:start w:val="1"/>
+      <w:numFmt w:val="bullet"/>
+      <w:lvlText w:val=""/>
+      <w:lvlJc w:val="left"/>
+      <w:pPr>
+        <w:tabs>
+          <w:tab w:val="num" w:pos="2880"/>
+        </w:tabs>
+        <w:ind w:left="2880" w:hanging="360"/>
+      </w:pPr>
+      <w:rPr>
+        <w:rFonts w:ascii="Symbol" w:hAnsi="Symbol" w:hint="default"/>
+        <w:sz w:val="20"/>
+      </w:rPr>
+    </w:lvl>
+    <w:lvl w:ilvl="4" w:tentative="1">
+      <w:start w:val="1"/>
+      <w:numFmt w:val="bullet"/>
+      <w:lvlText w:val=""/>
+      <w:lvlJc w:val="left"/>
+      <w:pPr>
+        <w:tabs>
+          <w:tab w:val="num" w:pos="3600"/>
+        </w:tabs>
+        <w:ind w:left="3600" w:hanging="360"/>
+      </w:pPr>
+      <w:rPr>
+        <w:rFonts w:ascii="Symbol" w:hAnsi="Symbol" w:hint="default"/>
+        <w:sz w:val="20"/>
+      </w:rPr>
+    </w:lvl>
+    <w:lvl w:ilvl="5" w:tentative="1">
+      <w:start w:val="1"/>
+      <w:numFmt w:val="bullet"/>
+      <w:lvlText w:val=""/>
+      <w:lvlJc w:val="left"/>
+      <w:pPr>
+        <w:tabs>
+          <w:tab w:val="num" w:pos="4320"/>
+        </w:tabs>
+        <w:ind w:left="4320" w:hanging="360"/>
+      </w:pPr>
+      <w:rPr>
+        <w:rFonts w:ascii="Symbol" w:hAnsi="Symbol" w:hint="default"/>
+        <w:sz w:val="20"/>
+      </w:rPr>
+    </w:lvl>
+    <w:lvl w:ilvl="6" w:tentative="1">
+      <w:start w:val="1"/>
+      <w:numFmt w:val="bullet"/>
+      <w:lvlText w:val=""/>
+      <w:lvlJc w:val="left"/>
+      <w:pPr>
+        <w:tabs>
+          <w:tab w:val="num" w:pos="5040"/>
+        </w:tabs>
+        <w:ind w:left="5040" w:hanging="360"/>
+      </w:pPr>
+      <w:rPr>
+        <w:rFonts w:ascii="Symbol" w:hAnsi="Symbol" w:hint="default"/>
+        <w:sz w:val="20"/>
+      </w:rPr>
+    </w:lvl>
+    <w:lvl w:ilvl="7" w:tentative="1">
+      <w:start w:val="1"/>
+      <w:numFmt w:val="bullet"/>
+      <w:lvlText w:val=""/>
+      <w:lvlJc w:val="left"/>
+      <w:pPr>
+        <w:tabs>
+          <w:tab w:val="num" w:pos="5760"/>
+        </w:tabs>
+        <w:ind w:left="5760" w:hanging="360"/>
+      </w:pPr>
+      <w:rPr>
+        <w:rFonts w:ascii="Symbol" w:hAnsi="Symbol" w:hint="default"/>
+        <w:sz w:val="20"/>
+      </w:rPr>
+    </w:lvl>
+    <w:lvl w:ilvl="8" w:tentative="1">
+      <w:start w:val="1"/>
+      <w:numFmt w:val="bullet"/>
+      <w:lvlText w:val=""/>
+      <w:lvlJc w:val="left"/>
+      <w:pPr>
+        <w:tabs>
+          <w:tab w:val="num" w:pos="6480"/>
+        </w:tabs>
+        <w:ind w:left="6480" w:hanging="360"/>
+      </w:pPr>
+      <w:rPr>
+        <w:rFonts w:ascii="Symbol" w:hAnsi="Symbol" w:hint="default"/>
+        <w:sz w:val="20"/>
+      </w:rPr>
+    </w:lvl>
+  </w:abstractNum>
+  <w:abstractNum w:abstractNumId="3" w15:restartNumberingAfterBreak="0">
+    <w:nsid w:val="74F41786"/>
+    <w:multiLevelType w:val="multilevel"/>
+    <w:tmpl w:val="4C84E0BE"/>
+    <w:lvl w:ilvl="0">
+      <w:start w:val="1"/>
+      <w:numFmt w:val="bullet"/>
+      <w:lvlText w:val=""/>
+      <w:lvlJc w:val="left"/>
+      <w:pPr>
+        <w:tabs>
+          <w:tab w:val="num" w:pos="720"/>
+        </w:tabs>
+        <w:ind w:left="720" w:hanging="360"/>
+      </w:pPr>
+      <w:rPr>
+        <w:rFonts w:ascii="Symbol" w:hAnsi="Symbol" w:hint="default"/>
+        <w:sz w:val="20"/>
+      </w:rPr>
+    </w:lvl>
+    <w:lvl w:ilvl="1" w:tentative="1">
+      <w:start w:val="1"/>
+      <w:numFmt w:val="bullet"/>
+      <w:lvlText w:val="o"/>
+      <w:lvlJc w:val="left"/>
+      <w:pPr>
+        <w:tabs>
+          <w:tab w:val="num" w:pos="1440"/>
+        </w:tabs>
+        <w:ind w:left="1440" w:hanging="360"/>
+      </w:pPr>
+      <w:rPr>
+        <w:rFonts w:ascii="Courier New" w:hAnsi="Courier New" w:hint="default"/>
+        <w:sz w:val="20"/>
+      </w:rPr>
+    </w:lvl>
+    <w:lvl w:ilvl="2" w:tentative="1">
+      <w:start w:val="1"/>
+      <w:numFmt w:val="bullet"/>
+      <w:lvlText w:val=""/>
+      <w:lvlJc w:val="left"/>
+      <w:pPr>
+        <w:tabs>
+          <w:tab w:val="num" w:pos="2160"/>
+        </w:tabs>
+        <w:ind w:left="2160" w:hanging="360"/>
+      </w:pPr>
+      <w:rPr>
+        <w:rFonts w:ascii="Wingdings" w:hAnsi="Wingdings" w:hint="default"/>
+        <w:sz w:val="20"/>
+      </w:rPr>
+    </w:lvl>
+    <w:lvl w:ilvl="3" w:tentative="1">
+      <w:start w:val="1"/>
+      <w:numFmt w:val="bullet"/>
+      <w:lvlText w:val=""/>
+      <w:lvlJc w:val="left"/>
+      <w:pPr>
+        <w:tabs>
+          <w:tab w:val="num" w:pos="2880"/>
+        </w:tabs>
+        <w:ind w:left="2880" w:hanging="360"/>
+      </w:pPr>
+      <w:rPr>
+        <w:rFonts w:ascii="Wingdings" w:hAnsi="Wingdings" w:hint="default"/>
+        <w:sz w:val="20"/>
+      </w:rPr>
+    </w:lvl>
+    <w:lvl w:ilvl="4" w:tentative="1">
+      <w:start w:val="1"/>
+      <w:numFmt w:val="bullet"/>
+      <w:lvlText w:val=""/>
+      <w:lvlJc w:val="left"/>
+      <w:pPr>
+        <w:tabs>
+          <w:tab w:val="num" w:pos="3600"/>
+        </w:tabs>
+        <w:ind w:left="3600" w:hanging="360"/>
+      </w:pPr>
+      <w:rPr>
+        <w:rFonts w:ascii="Wingdings" w:hAnsi="Wingdings" w:hint="default"/>
+        <w:sz w:val="20"/>
+      </w:rPr>
+    </w:lvl>
+    <w:lvl w:ilvl="5" w:tentative="1">
+      <w:start w:val="1"/>
+      <w:numFmt w:val="bullet"/>
+      <w:lvlText w:val=""/>
+      <w:lvlJc w:val="left"/>
+      <w:pPr>
+        <w:tabs>
+          <w:tab w:val="num" w:pos="4320"/>
+        </w:tabs>
+        <w:ind w:left="4320" w:hanging="360"/>
+      </w:pPr>
+      <w:rPr>
+        <w:rFonts w:ascii="Wingdings" w:hAnsi="Wingdings" w:hint="default"/>
+        <w:sz w:val="20"/>
+      </w:rPr>
+    </w:lvl>
+    <w:lvl w:ilvl="6" w:tentative="1">
+      <w:start w:val="1"/>
+      <w:numFmt w:val="bullet"/>
+      <w:lvlText w:val=""/>
+      <w:lvlJc w:val="left"/>
+      <w:pPr>
+        <w:tabs>
+          <w:tab w:val="num" w:pos="5040"/>
+        </w:tabs>
+        <w:ind w:left="5040" w:hanging="360"/>
+      </w:pPr>
+      <w:rPr>
+        <w:rFonts w:ascii="Wingdings" w:hAnsi="Wingdings" w:hint="default"/>
+        <w:sz w:val="20"/>
+      </w:rPr>
+    </w:lvl>
+    <w:lvl w:ilvl="7" w:tentative="1">
+      <w:start w:val="1"/>
+      <w:numFmt w:val="bullet"/>
+      <w:lvlText w:val=""/>
+      <w:lvlJc w:val="left"/>
+      <w:pPr>
+        <w:tabs>
+          <w:tab w:val="num" w:pos="5760"/>
+        </w:tabs>
+        <w:ind w:left="5760" w:hanging="360"/>
+      </w:pPr>
+      <w:rPr>
+        <w:rFonts w:ascii="Wingdings" w:hAnsi="Wingdings" w:hint="default"/>
+        <w:sz w:val="20"/>
+      </w:rPr>
+    </w:lvl>
+    <w:lvl w:ilvl="8" w:tentative="1">
+      <w:start w:val="1"/>
+      <w:numFmt w:val="bullet"/>
+      <w:lvlText w:val=""/>
+      <w:lvlJc w:val="left"/>
+      <w:pPr>
+        <w:tabs>
+          <w:tab w:val="num" w:pos="6480"/>
+        </w:tabs>
+        <w:ind w:left="6480" w:hanging="360"/>
+      </w:pPr>
+      <w:rPr>
+        <w:rFonts w:ascii="Wingdings" w:hAnsi="Wingdings" w:hint="default"/>
+        <w:sz w:val="20"/>
+      </w:rPr>
+    </w:lvl>
+  </w:abstractNum>
+  <w:num w:numId="1" w16cid:durableId="821779456">
+    <w:abstractNumId w:val="1"/>
+  </w:num>
+  <w:num w:numId="2" w16cid:durableId="982151249">
+    <w:abstractNumId w:val="2"/>
+  </w:num>
+  <w:num w:numId="3" w16cid:durableId="727727210">
+    <w:abstractNumId w:val="3"/>
+  </w:num>
+  <w:num w:numId="4" w16cid:durableId="1407413776">
     <w:abstractNumId w:val="0"/>
   </w:num>
 </w:numbering>
 </file>
 
 <file path=word/styles.xml><?xml version="1.0" encoding="utf-8"?>
-<w:styles xmlns:mc="http://schemas.openxmlformats.org/markup-compatibility/2006" xmlns:r="http://schemas.openxmlformats.org/officeDocument/2006/relationships" xmlns:w="http://schemas.openxmlformats.org/wordprocessingml/2006/main" xmlns:w14="http://schemas.microsoft.com/office/word/2010/wordml" xmlns:w15="http://schemas.microsoft.com/office/word/2012/wordml" xmlns:w16se="http://schemas.microsoft.com/office/word/2015/wordml/symex" mc:Ignorable="w14 w15 w16se">
+<w:styles xmlns:mc="http://schemas.openxmlformats.org/markup-compatibility/2006" xmlns:r="http://schemas.openxmlformats.org/officeDocument/2006/relationships" xmlns:w="http://schemas.openxmlformats.org/wordprocessingml/2006/main" xmlns:w14="http://schemas.microsoft.com/office/word/2010/wordml" xmlns:w15="http://schemas.microsoft.com/office/word/2012/wordml" xmlns:w16cex="http://schemas.microsoft.com/office/word/2018/wordml/cex" xmlns:w16cid="http://schemas.microsoft.com/office/word/2016/wordml/cid" xmlns:w16="http://schemas.microsoft.com/office/word/2018/wordml" xmlns:w16du="http://schemas.microsoft.com/office/word/2023/wordml/word16du" xmlns:w16sdtdh="http://schemas.microsoft.com/office/word/2020/wordml/sdtdatahash" xmlns:w16sdtfl="http://schemas.microsoft.com/office/word/2024/wordml/sdtformatlock" xmlns:w16se="http://schemas.microsoft.com/office/word/2015/wordml/symex" mc:Ignorable="w14 w15 w16se w16cid w16 w16cex w16sdtdh w16sdtfl w16du">
   <w:docDefaults>
     <w:rPrDefault>
       <w:rPr>
@@ -3785,7 +5499,7 @@
     </w:rPrDefault>
     <w:pPrDefault/>
   </w:docDefaults>
-  <w:latentStyles w:defLockedState="0" w:defUIPriority="99" w:defSemiHidden="0" w:defUnhideWhenUsed="0" w:defQFormat="0" w:count="371">
+  <w:latentStyles w:defLockedState="0" w:defUIPriority="99" w:defSemiHidden="0" w:defUnhideWhenUsed="0" w:defQFormat="0" w:count="376">
     <w:lsdException w:name="Normal" w:uiPriority="0" w:qFormat="1"/>
     <w:lsdException w:name="heading 1" w:uiPriority="9" w:qFormat="1"/>
     <w:lsdException w:name="heading 2" w:semiHidden="1" w:uiPriority="9" w:unhideWhenUsed="1" w:qFormat="1"/>
@@ -4157,6 +5871,11 @@
     <w:lsdException w:name="List Table 5 Dark Accent 6" w:uiPriority="50"/>
     <w:lsdException w:name="List Table 6 Colorful Accent 6" w:uiPriority="51"/>
     <w:lsdException w:name="List Table 7 Colorful Accent 6" w:uiPriority="52"/>
+    <w:lsdException w:name="Mention" w:semiHidden="1" w:unhideWhenUsed="1"/>
+    <w:lsdException w:name="Smart Hyperlink" w:semiHidden="1" w:unhideWhenUsed="1"/>
+    <w:lsdException w:name="Hashtag" w:semiHidden="1" w:unhideWhenUsed="1"/>
+    <w:lsdException w:name="Unresolved Mention" w:semiHidden="1" w:unhideWhenUsed="1"/>
+    <w:lsdException w:name="Smart Link" w:semiHidden="1" w:unhideWhenUsed="1"/>
   </w:latentStyles>
   <w:style w:type="paragraph" w:default="1" w:styleId="Normal">
     <w:name w:val="Normal"/>
@@ -4195,7 +5914,6 @@
   <w:style w:type="character" w:default="1" w:styleId="Fuentedeprrafopredeter">
     <w:name w:val="Default Paragraph Font"/>
     <w:uiPriority w:val="1"/>
-    <w:semiHidden/>
     <w:unhideWhenUsed/>
   </w:style>
   <w:style w:type="table" w:default="1" w:styleId="Tablanormal">
@@ -4458,6 +6176,29 @@
       <w:bCs/>
       <w:sz w:val="20"/>
       <w:szCs w:val="20"/>
+    </w:rPr>
+  </w:style>
+  <w:style w:type="character" w:styleId="Hipervnculo">
+    <w:name w:val="Hyperlink"/>
+    <w:basedOn w:val="Fuentedeprrafopredeter"/>
+    <w:uiPriority w:val="99"/>
+    <w:unhideWhenUsed/>
+    <w:rsid w:val="00BA5271"/>
+    <w:rPr>
+      <w:color w:val="0563C1" w:themeColor="hyperlink"/>
+      <w:u w:val="single"/>
+    </w:rPr>
+  </w:style>
+  <w:style w:type="character" w:styleId="Mencinsinresolver">
+    <w:name w:val="Unresolved Mention"/>
+    <w:basedOn w:val="Fuentedeprrafopredeter"/>
+    <w:uiPriority w:val="99"/>
+    <w:semiHidden/>
+    <w:unhideWhenUsed/>
+    <w:rsid w:val="00BA5271"/>
+    <w:rPr>
+      <w:color w:val="605E5C"/>
+      <w:shd w:val="clear" w:color="auto" w:fill="E1DFDD"/>
     </w:rPr>
   </w:style>
 </w:styles>
@@ -4759,9 +6500,12 @@
 </file>
 
 <file path=customXml/item1.xml><?xml version="1.0" encoding="utf-8"?>
-<p:properties xmlns:p="http://schemas.microsoft.com/office/2006/metadata/properties" xmlns:xsi="http://www.w3.org/2001/XMLSchema-instance" xmlns:pc="http://schemas.microsoft.com/office/infopath/2007/PartnerControls">
-  <documentManagement/>
-</p:properties>
+<?mso-contentType ?>
+<FormTemplates xmlns="http://schemas.microsoft.com/sharepoint/v3/contenttype/forms">
+  <Display>DocumentLibraryForm</Display>
+  <Edit>DocumentLibraryForm</Edit>
+  <New>DocumentLibraryForm</New>
+</FormTemplates>
 </file>
 
 <file path=customXml/item2.xml><?xml version="1.0" encoding="utf-8"?>
@@ -4897,26 +6641,15 @@
 </file>
 
 <file path=customXml/item3.xml><?xml version="1.0" encoding="utf-8"?>
-<?mso-contentType ?>
-<FormTemplates xmlns="http://schemas.microsoft.com/sharepoint/v3/contenttype/forms">
-  <Display>DocumentLibraryForm</Display>
-  <Edit>DocumentLibraryForm</Edit>
-  <New>DocumentLibraryForm</New>
-</FormTemplates>
+<p:properties xmlns:p="http://schemas.microsoft.com/office/2006/metadata/properties" xmlns:xsi="http://www.w3.org/2001/XMLSchema-instance" xmlns:pc="http://schemas.microsoft.com/office/infopath/2007/PartnerControls">
+  <documentManagement/>
+</p:properties>
 </file>
 
 <file path=customXml/itemProps1.xml><?xml version="1.0" encoding="utf-8"?>
-<ds:datastoreItem xmlns:ds="http://schemas.openxmlformats.org/officeDocument/2006/customXml" ds:itemID="{46CA5683-AF87-4E40-B841-2E23A3B52406}">
+<ds:datastoreItem xmlns:ds="http://schemas.openxmlformats.org/officeDocument/2006/customXml" ds:itemID="{D51C61E4-DB75-4684-AD25-71F546404E96}">
   <ds:schemaRefs>
-    <ds:schemaRef ds:uri="http://purl.org/dc/terms/"/>
-    <ds:schemaRef ds:uri="http://purl.org/dc/elements/1.1/"/>
-    <ds:schemaRef ds:uri="http://schemas.openxmlformats.org/package/2006/metadata/core-properties"/>
-    <ds:schemaRef ds:uri="http://www.w3.org/XML/1998/namespace"/>
-    <ds:schemaRef ds:uri="http://schemas.microsoft.com/office/2006/metadata/properties"/>
-    <ds:schemaRef ds:uri="http://schemas.microsoft.com/office/2006/documentManagement/types"/>
-    <ds:schemaRef ds:uri="http://purl.org/dc/dcmitype/"/>
-    <ds:schemaRef ds:uri="http://schemas.microsoft.com/office/infopath/2007/PartnerControls"/>
-    <ds:schemaRef ds:uri="126e8a1c-9ea9-435a-ac89-d06c80d62e30"/>
+    <ds:schemaRef ds:uri="http://schemas.microsoft.com/sharepoint/v3/contenttype/forms"/>
   </ds:schemaRefs>
 </ds:datastoreItem>
 </file>
@@ -4940,9 +6673,10 @@
 </file>
 
 <file path=customXml/itemProps3.xml><?xml version="1.0" encoding="utf-8"?>
-<ds:datastoreItem xmlns:ds="http://schemas.openxmlformats.org/officeDocument/2006/customXml" ds:itemID="{D51C61E4-DB75-4684-AD25-71F546404E96}">
+<ds:datastoreItem xmlns:ds="http://schemas.openxmlformats.org/officeDocument/2006/customXml" ds:itemID="{46CA5683-AF87-4E40-B841-2E23A3B52406}">
   <ds:schemaRefs>
-    <ds:schemaRef ds:uri="http://schemas.microsoft.com/sharepoint/v3/contenttype/forms"/>
+    <ds:schemaRef ds:uri="http://schemas.microsoft.com/office/2006/metadata/properties"/>
+    <ds:schemaRef ds:uri="http://schemas.microsoft.com/office/infopath/2007/PartnerControls"/>
   </ds:schemaRefs>
 </ds:datastoreItem>
 </file>
</xml_diff>